<commit_message>
Add kit-named project architecture diagram as report Figure 1.
Replace Figure 1 with the 37-in-1 kit architecture plan (Shock, TEMP 18B20, buzzer) and update the caption.

Co-authored-by: Amit shrestha <Amit-shrestha63@users.noreply.github.com>
</commit_message>
<xml_diff>
--- a/MDA691_Assignment2_Group_Report_SUBMISSION.docx
+++ b/MDA691_Assignment2_Group_Report_SUBMISSION.docx
@@ -1346,11 +1346,7 @@
         <w:spacing w:after="120"/>
       </w:pPr>
       <w:r>
-        <w:rPr>
-          <w:rFonts w:ascii="Times New Roman" w:hAnsi="Times New Roman"/>
-          <w:sz w:val="22"/>
-        </w:rPr>
-        <w:t>This report converts the preliminary concept from Assignment 1b into an implementable project plan and intermediate design for eLabtronics/runlinc [33]. The capstone delivers a laboratory prototype on client-supplied STEMSEL E32W (ESP32) hardware [34] programmed through the runlinc IDE (MicroPython) [35]. The team collects all real-time sensor data from its own E32W lab kit — not from the client factory or plant systems.</w:t>
+        <w:t>This report converts the preliminary concept from Assignment 1b into an implementable project plan and intermediate design for eLabtronics/runlinc. The capstone delivers a laboratory prototype on client-supplied STEMSEL E32W (ESP32) hardware programmed through the runlinc IDE (MicroPython). The team collects all real-time sensor data from its own E32W lab kit — not from the client factory or plant systems.</w:t>
       </w:r>
     </w:p>
     <w:p>
@@ -1358,11 +1354,7 @@
         <w:spacing w:after="120"/>
       </w:pPr>
       <w:r>
-        <w:rPr>
-          <w:rFonts w:ascii="Times New Roman" w:hAnsi="Times New Roman"/>
-          <w:sz w:val="22"/>
-        </w:rPr>
-        <w:t>The proposed contribution is a dual-path architecture: millisecond ISO 10816-3 reflex alarms on the edge [29], combined with slower agentic reasoning (runlinc AI Assistant) for maintenance recommendations [11], [13], simulated ERP tool calls [12], and an auditable Thought Log dashboard [27]. Assignment 2 focuses on planning, requirements refinement, and intermediate design; full implementation and demonstration are scheduled for MDA692.</w:t>
+        <w:t>The proposed contribution is a dual-path architecture: millisecond ISO 10816 reflex alarms on the edge, combined with slower agentic reasoning (runlinc AI Assistant) for maintenance recommendations, simulated ERP tool calls, and an auditable Thought Log dashboard. Assignment 2 focuses on planning, requirements refinement, and intermediate design; full implementation and demonstration are scheduled for MDA692.</w:t>
       </w:r>
     </w:p>
     <w:p>
@@ -1386,11 +1378,7 @@
         <w:spacing w:after="120"/>
       </w:pPr>
       <w:r>
-        <w:rPr>
-          <w:rFonts w:ascii="Times New Roman" w:hAnsi="Times New Roman"/>
-          <w:sz w:val="22"/>
-        </w:rPr>
-        <w:t>Industrial predictive maintenance increasingly combines edge sensing, machine learning, and AI agents [1], [36], [38], but few published systems integrate all three on a low-cost ESP32 platform with explicit safety-path separation [7], [40]. This project advances practice by demonstrating traceable edge-to-agent workflows on runlinc hardware [33] using team-collected lab data supplemented by public RUL benchmarks (C-MAPSS [3], XJTU-SY [5]).</w:t>
+        <w:t>Industrial predictive maintenance increasingly combines edge sensing, machine learning, and AI agents, but few published systems integrate all three on a low-cost ESP32 platform with explicit safety-path separation. This project advances practice by demonstrating traceable edge-to-agent workflows on runlinc hardware using team-collected lab data supplemented by public RUL benchmarks (C-MAPSS, XJTU-SY).</w:t>
       </w:r>
     </w:p>
     <w:p>
@@ -1414,11 +1402,7 @@
         <w:spacing w:after="120"/>
       </w:pPr>
       <w:r>
-        <w:rPr>
-          <w:rFonts w:ascii="Times New Roman" w:hAnsi="Times New Roman"/>
-          <w:sz w:val="22"/>
-        </w:rPr>
-        <w:t>Unplanned equipment failures cause downtime, cost, and safety risk [1]. Industry 4.0 enables continuous condition monitoring via IIoT sensors [23], but cloud-only analytics introduce latency and connectivity dependencies [20], [21]. Agentic AI can automate maintenance decisions [11], [31], yet must not delay safety-critical reflex alarms [29]. The eLabtronics E32W platform provides a controlled environment to evaluate this trade-off [33], [34].</w:t>
+        <w:t>Unplanned equipment failures cause downtime, cost, and safety risk. Industry 4.0 enables continuous condition monitoring via IIoT sensors, but cloud-only analytics introduce latency and connectivity dependencies. Agentic AI can automate maintenance decisions, yet must not delay safety-critical reflex alarms. The eLabtronics E32W platform provides a controlled environment to evaluate this trade-off.</w:t>
       </w:r>
     </w:p>
     <w:p>
@@ -1987,11 +1971,7 @@
         <w:spacing w:after="120"/>
       </w:pPr>
       <w:r>
-        <w:rPr>
-          <w:rFonts w:ascii="Times New Roman" w:hAnsi="Times New Roman"/>
-          <w:sz w:val="22"/>
-        </w:rPr>
-        <w:t>Prior PdM surveys (Zonta et al. [1]; Alaoui et al. [36]) establish the Industry 4.0 context but treat edge hardware, RUL modelling, and agentic orchestration as separate concerns. Edge vibration studies on ESP32 (Kolok et al. [7]; Gupta and Shivhare [40]) demonstrate feasible anomaly detection at low cost, yet stop at classification — they do not publish RUL estimates, agent tool contracts, or auditable maintenance workflows. Conversely, LSTM RUL work (Zheng et al. [4]; Wu et al. [2]) achieves strong benchmark accuracy but assumes cloud-scale compute and omits millisecond safety reflexes [29].</w:t>
+        <w:t>Prior PdM surveys (Zonta et al. [1]) establish the Industry 4.0 context but treat edge hardware, RUL modelling, and agentic orchestration as separate concerns. Edge vibration studies on ESP32 (Kolok et al. [7]) demonstrate feasible anomaly detection at low cost, yet stop at classification — they do not publish RUL estimates, agent tool contracts, or auditable maintenance workflows. Conversely, LSTM RUL work (Zheng et al. [4], Wu et al. [2]) achieves strong benchmark accuracy but assumes cloud-scale compute and omits millisecond safety reflexes.</w:t>
       </w:r>
     </w:p>
     <w:p>
@@ -1999,11 +1979,7 @@
         <w:spacing w:after="120"/>
       </w:pPr>
       <w:r>
-        <w:rPr>
-          <w:rFonts w:ascii="Times New Roman" w:hAnsi="Times New Roman"/>
-          <w:sz w:val="22"/>
-        </w:rPr>
-        <w:t>Agentic AI frameworks (ReAct [11]; Toolformer [12]; Rayfield et al. [13]; Zhou et al. [14]) show that tool-augmented LLMs can automate multi-step tasks, but published deployments rarely constrain tool schemas for safety-critical maintenance or separate reflex alarms from deliberative reasoning [15], [31], [32]. Explainability research (Nor et al. [16]; Matzka [17]; Gawde et al. [39]; Lundberg and Lee [26]) highlights trust and hallucination risks that matter when an agent recommends downtime or parts ordering [15], [27]. Our design therefore combines: (i) deterministic ISO 10816-3 reflex on-device [29], (ii) feature-vector RUL from validated models [4], [5], and (iii) schema-validated agent tools with a Thought Log [11], [27] — a combination not found as an integrated system on the runlinc E32W platform [33].</w:t>
+        <w:t>Agentic AI frameworks (ReAct [11], industrial surveys [13]) show that tool-augmented LLMs can automate multi-step tasks, but published deployments rarely constrain tool schemas for safety-critical maintenance or separate reflex alarms from deliberative reasoning. Explainability research (Nor et al. [16], Huang et al. [15]) highlights trust and hallucination risks that matter when an agent recommends downtime or parts ordering. Our design therefore combines: (i) deterministic ISO reflex on-device, (ii) feature-vector RUL from validated models, and (iii) schema-validated agent tools with a Thought Log — a combination not found as an integrated system on the runlinc E32W platform.</w:t>
       </w:r>
     </w:p>
     <w:p>
@@ -2173,7 +2149,7 @@
           </w:tcPr>
           <w:p>
             <w:r>
-              <w:t>Kolok [7], Gupta and Shivhare [40]</w:t>
+              <w:t>Kolok [7], TinyML ESP32 2025</w:t>
             </w:r>
           </w:p>
         </w:tc>
@@ -2380,11 +2356,7 @@
         <w:spacing w:after="120"/>
       </w:pPr>
       <w:r>
-        <w:rPr>
-          <w:rFonts w:ascii="Times New Roman" w:hAnsi="Times New Roman"/>
-          <w:sz w:val="22"/>
-        </w:rPr>
-        <w:t>Research gap: no integrated end-to-end system combines ESP32 edge reflex alarms [7], [40], LSTM RUL [2], [4], and schema-validated agentic maintenance tools [11], [13], [14] on the runlinc E32W platform with team-collected lab telemetry [33]. Table 1 summarises how prior work falls short and how this project advances the state of practice.</w:t>
+        <w:t>Research gap: no integrated end-to-end system combines ESP32 edge reflex alarms, LSTM RUL, and schema-validated agentic maintenance tools on the runlinc E32W platform with team-collected lab telemetry. Table 1 summarises how prior work falls short and how this project advances the state of practice.</w:t>
       </w:r>
     </w:p>
     <w:p>
@@ -2400,13 +2372,12 @@
         <w:spacing w:after="120"/>
       </w:pPr>
       <w:r>
-        <w:rPr>
-          <w:rFonts w:ascii="Times New Roman" w:hAnsi="Times New Roman"/>
-          <w:sz w:val="22"/>
-        </w:rPr>
-        <w:t>The gap is not merely technical — it is architectural and operational. Factory PdM systems often assume always-on cloud connectivity and human-in-the-loop alarm acknowledgement [1], [19], [20]. Our capstone instead tests whether a student-team-scale prototype on client-supplied hardware can meet measurable targets for reflex latency [29], RUL accuracy [4], and agent traceability [11], [27] within a single trimester design phase, using lab data rather than production plant telemetry. This positions the project as a reproducible reference implementation for eLabtronics/runlinc [33] rather than a generic Industry 4.0 survey [1], [36].</w:t>
-      </w:r>
-      <w:r/>
+        <w:t xml:space="preserve">The gap is not merely technical — it is architectural and operational. Factory PdM systems often assume always-on cloud connectivity and human-in-the-loop alarm acknowledgement. Our capstone instead tests whether a student-team-scale prototype on client-supplied hardware can meet measurable targets for reflex latency, RUL accuracy, and agent traceability within a single </w:t>
+      </w:r>
+      <w:r>
+        <w:lastRenderedPageBreak/>
+        <w:t>trimester design phase, using lab data rather than production plant telemetry. This positions the project as a reproducible reference implementation for eLabtronics/runlinc rather than a generic Industry 4.0 survey.</w:t>
+      </w:r>
     </w:p>
     <w:p>
       <w:pPr>
@@ -2862,11 +2833,7 @@
         <w:spacing w:after="120"/>
       </w:pPr>
       <w:r>
-        <w:rPr>
-          <w:rFonts w:ascii="Times New Roman" w:hAnsi="Times New Roman"/>
-          <w:sz w:val="22"/>
-        </w:rPr>
-        <w:t>Primary data source: team-collected real-time streams from client-supplied E32W and 37-in-1 sensor kit [33], [34]. Client factory/plant telemetry is explicitly out of scope. Supplementary benchmark datasets (C-MAPSS FD001 [3], XJTU-SY bearings [5]) support RUL model training where lab data lacks sufficient failure labels [2], [4].</w:t>
+        <w:t>Primary data source: team-collected real-time streams from client-supplied E32W and 37-in-1 sensor kit. Client factory/plant telemetry is explicitly out of scope. Supplementary benchmark datasets (C-MAPSS FD001, XJTU-SY bearings) support RUL model training where lab data lacks sufficient failure labels.</w:t>
       </w:r>
     </w:p>
     <w:p>
@@ -3549,11 +3516,7 @@
         <w:spacing w:after="120"/>
       </w:pPr>
       <w:r>
-        <w:rPr>
-          <w:rFonts w:ascii="Times New Roman" w:hAnsi="Times New Roman"/>
-          <w:sz w:val="22"/>
-        </w:rPr>
-        <w:t>The team maps project stages to the data science project lifecycle practised in MDA512 and the CRISP-DM process model. Each stage produces a verifiable deliverable and a decision gate before the next stage begins. Because hardware access and agent behaviour introduce uncertainty [11], [31], failed quality checks return work to requirements or data preparation rather than proceeding to deployment [20].</w:t>
+        <w:t>The team maps project stages to the data science project lifecycle practised in MDA512 and CRISP-DM [12]. Each stage produces a verifiable deliverable and a decision gate before the next stage begins. Because hardware access and agent behaviour introduce uncertainty, failed quality checks return work to requirements or data preparation rather than proceeding to deployment.</w:t>
       </w:r>
     </w:p>
     <w:tbl>
@@ -4053,11 +4016,7 @@
         <w:spacing w:after="120"/>
       </w:pPr>
       <w:r>
-        <w:rPr>
-          <w:rFonts w:ascii="Times New Roman" w:hAnsi="Times New Roman"/>
-          <w:sz w:val="22"/>
-        </w:rPr>
-        <w:t>A lightweight Agile approach is used because hardware access, client-data suitability, and agent behaviour create uncertainty [14], [31]. Work is planned in one-week iterations aligned with supervision meetings. Each sprint delivers a demonstrable increment mapped to objectives in Table §2.4, consistent with human–AI interaction guidelines for reviewable tool use [27].</w:t>
+        <w:t>A lightweight Agile approach is used because hardware access, client-data suitability, and agent behaviour create uncertainty. Work is planned in one-week iterations aligned with supervision meetings. Each sprint delivers a demonstrable increment mapped to objectives in Table §2.4.</w:t>
       </w:r>
     </w:p>
     <w:p>
@@ -4121,11 +4080,7 @@
         <w:spacing w:after="120"/>
       </w:pPr>
       <w:r>
-        <w:rPr>
-          <w:rFonts w:ascii="Times New Roman" w:hAnsi="Times New Roman"/>
-          <w:sz w:val="22"/>
-        </w:rPr>
-        <w:t>Continuous integration runs linting, unit tests, JSON schema tests, and a deterministic replay on every merge request. Hardware tests remain a controlled manual gate. Architecture decision records (ADR) document the reflex/agent split [29], [11]. OpenAPI specifies mock ERP endpoints inspired by tool-using LLM patterns [12]; the Thought Log serves as the audit artefact for explainable maintenance actions [16], [17], [27].</w:t>
+        <w:t>Continuous integration runs linting, unit tests, JSON schema tests, and a deterministic replay on every merge request. Hardware tests remain a controlled manual gate. Architecture decision records (ADR) document the reflex/agent split. OpenAPI specifies mock ERP endpoints; the Thought Log serves as the audit artefact.</w:t>
       </w:r>
     </w:p>
     <w:p>
@@ -4149,32 +4104,30 @@
         <w:spacing w:after="120"/>
       </w:pPr>
       <w:r>
-        <w:t>Figure 1 shows the four-layer architecture with team hardware as the primary data source.</w:t>
+        <w:t>Figure 1 shows the four-layer project architecture plan with 37-in-1 kit module names (Shock, TEMP 18B20, buzzer) and team hardware as the primary data source.</w:t>
       </w:r>
     </w:p>
     <w:p>
-      <w:r>
-        <w:rPr>
-          <w:noProof/>
-        </w:rPr>
-        <w:lastRenderedPageBreak/>
+      <w:pPr>
+        <w:jc w:val="center"/>
+      </w:pPr>
+      <w:r>
         <w:drawing>
-          <wp:inline distT="0" distB="0" distL="0" distR="0" wp14:anchorId="15685270" wp14:editId="5E2F4A6F">
-            <wp:extent cx="5943600" cy="3542425"/>
-            <wp:effectExtent l="0" t="0" r="0" b="0"/>
-            <wp:docPr id="1" name="Picture 1"/>
+          <wp:inline xmlns:a="http://schemas.openxmlformats.org/drawingml/2006/main" xmlns:pic="http://schemas.openxmlformats.org/drawingml/2006/picture">
+            <wp:extent cx="5943600" cy="3167478"/>
+            <wp:docPr id="18" name="Picture 18"/>
             <wp:cNvGraphicFramePr>
-              <a:graphicFrameLocks xmlns:a="http://schemas.openxmlformats.org/drawingml/2006/main" noChangeAspect="1"/>
+              <a:graphicFrameLocks noChangeAspect="1"/>
             </wp:cNvGraphicFramePr>
-            <a:graphic xmlns:a="http://schemas.openxmlformats.org/drawingml/2006/main">
+            <a:graphic>
               <a:graphicData uri="http://schemas.openxmlformats.org/drawingml/2006/picture">
-                <pic:pic xmlns:pic="http://schemas.openxmlformats.org/drawingml/2006/picture">
+                <pic:pic>
                   <pic:nvPicPr>
-                    <pic:cNvPr id="0" name="MDA691_PdM_Block_Diagram_FINAL.png"/>
+                    <pic:cNvPr id="0" name="1dd9f669-79a2-4f78-8f05-09af91fbd179.png"/>
                     <pic:cNvPicPr/>
                   </pic:nvPicPr>
                   <pic:blipFill>
-                    <a:blip r:embed="rId6"/>
+                    <a:blip r:embed="rId25"/>
                     <a:stretch>
                       <a:fillRect/>
                     </a:stretch>
@@ -4182,11 +4135,9 @@
                   <pic:spPr>
                     <a:xfrm>
                       <a:off x="0" y="0"/>
-                      <a:ext cx="5943600" cy="3542425"/>
+                      <a:ext cx="5943600" cy="3167478"/>
                     </a:xfrm>
-                    <a:prstGeom prst="rect">
-                      <a:avLst/>
-                    </a:prstGeom>
+                    <a:prstGeom prst="rect"/>
                   </pic:spPr>
                 </pic:pic>
               </a:graphicData>
@@ -4197,14 +4148,11 @@
     </w:p>
     <w:p>
       <w:pPr>
+        <w:pStyle w:val="Caption"/>
         <w:jc w:val="center"/>
       </w:pPr>
       <w:r>
-        <w:rPr>
-          <w:i/>
-          <w:sz w:val="20"/>
-        </w:rPr>
-        <w:t>Figure 1. Four-layer agentic PdM architecture — team-collected data on client-supplied E32W hardware.</w:t>
+        <w:t>Figure 1. Project architecture plan — 37-in-1 kit modules (Shock, TEMP 18B20, buzzer) with STEMSEL E32W dual-path edge reflex and agentic AI.</w:t>
       </w:r>
     </w:p>
     <w:p/>
@@ -4221,11 +4169,7 @@
         <w:spacing w:after="120"/>
       </w:pPr>
       <w:r>
-        <w:rPr>
-          <w:rFonts w:ascii="Times New Roman" w:hAnsi="Times New Roman"/>
-          <w:sz w:val="22"/>
-        </w:rPr>
-        <w:t>1 s windows, 50% overlap; RMS, peak-to-peak, crest factor, and FFT bands follow vibration condition-monitoring practice [28]. ISO 10816-3 reflex alarm triggers on threshold breach for non-rotating-part vibration evaluation [29]. On-device feature extraction is constrained by ESP32 resources and TinyML deployment limits [30], [34], [40].</w:t>
+        <w:t>1 s windows, 50% overlap; RMS, peak-to-peak, crest factor, FFT bands. ISO 10816-3 reflex alarm on breach.</w:t>
       </w:r>
     </w:p>
     <w:p>
@@ -4295,11 +4239,43 @@
     <w:p>
       <w:r>
         <w:rPr>
-          <w:rFonts w:ascii="Times New Roman" w:hAnsi="Times New Roman"/>
           <w:noProof/>
-          <w:sz w:val="22"/>
         </w:rPr>
-        <w:t>Feature vectors are published using MQTT topics for low-overhead IIoT transport [22], [23]. Figure 3 shows the logical data model and topic schema used by the edge publisher and agent subscriber.</w:t>
+        <w:drawing>
+          <wp:inline distT="0" distB="0" distL="0" distR="0" wp14:anchorId="248645FB" wp14:editId="4E377105">
+            <wp:extent cx="5943600" cy="3439570"/>
+            <wp:effectExtent l="0" t="0" r="0" b="0"/>
+            <wp:docPr id="3" name="Picture 3"/>
+            <wp:cNvGraphicFramePr>
+              <a:graphicFrameLocks xmlns:a="http://schemas.openxmlformats.org/drawingml/2006/main" noChangeAspect="1"/>
+            </wp:cNvGraphicFramePr>
+            <a:graphic xmlns:a="http://schemas.openxmlformats.org/drawingml/2006/main">
+              <a:graphicData uri="http://schemas.openxmlformats.org/drawingml/2006/picture">
+                <pic:pic xmlns:pic="http://schemas.openxmlformats.org/drawingml/2006/picture">
+                  <pic:nvPicPr>
+                    <pic:cNvPr id="0" name="Fig3_Data_Model_ER.png"/>
+                    <pic:cNvPicPr/>
+                  </pic:nvPicPr>
+                  <pic:blipFill>
+                    <a:blip r:embed="rId8"/>
+                    <a:stretch>
+                      <a:fillRect/>
+                    </a:stretch>
+                  </pic:blipFill>
+                  <pic:spPr>
+                    <a:xfrm>
+                      <a:off x="0" y="0"/>
+                      <a:ext cx="5943600" cy="3439570"/>
+                    </a:xfrm>
+                    <a:prstGeom prst="rect">
+                      <a:avLst/>
+                    </a:prstGeom>
+                  </pic:spPr>
+                </pic:pic>
+              </a:graphicData>
+            </a:graphic>
+          </wp:inline>
+        </w:drawing>
       </w:r>
     </w:p>
     <w:p>
@@ -4326,11 +4302,43 @@
     <w:p>
       <w:r>
         <w:rPr>
-          <w:rFonts w:ascii="Times New Roman" w:hAnsi="Times New Roman"/>
           <w:noProof/>
-          <w:sz w:val="22"/>
         </w:rPr>
-        <w:t>The RUL path trains an LSTM baseline on C-MAPSS/XJTU-SY labels [3]–[5] and applies the model to team E32W feature histories [2], [4]. SHAP summaries explain feature contributions to each RUL estimate [26], [39]. Figure 4 summarises the analytical workflow.</w:t>
+        <w:drawing>
+          <wp:inline distT="0" distB="0" distL="0" distR="0" wp14:anchorId="3FF7A78E" wp14:editId="1AE3CB27">
+            <wp:extent cx="5943600" cy="2440180"/>
+            <wp:effectExtent l="0" t="0" r="0" b="0"/>
+            <wp:docPr id="4" name="Picture 4"/>
+            <wp:cNvGraphicFramePr>
+              <a:graphicFrameLocks xmlns:a="http://schemas.openxmlformats.org/drawingml/2006/main" noChangeAspect="1"/>
+            </wp:cNvGraphicFramePr>
+            <a:graphic xmlns:a="http://schemas.openxmlformats.org/drawingml/2006/main">
+              <a:graphicData uri="http://schemas.openxmlformats.org/drawingml/2006/picture">
+                <pic:pic xmlns:pic="http://schemas.openxmlformats.org/drawingml/2006/picture">
+                  <pic:nvPicPr>
+                    <pic:cNvPr id="0" name="Fig4_RUL_Workflow.png"/>
+                    <pic:cNvPicPr/>
+                  </pic:nvPicPr>
+                  <pic:blipFill>
+                    <a:blip r:embed="rId9"/>
+                    <a:stretch>
+                      <a:fillRect/>
+                    </a:stretch>
+                  </pic:blipFill>
+                  <pic:spPr>
+                    <a:xfrm>
+                      <a:off x="0" y="0"/>
+                      <a:ext cx="5943600" cy="2440180"/>
+                    </a:xfrm>
+                    <a:prstGeom prst="rect">
+                      <a:avLst/>
+                    </a:prstGeom>
+                  </pic:spPr>
+                </pic:pic>
+              </a:graphicData>
+            </a:graphic>
+          </wp:inline>
+        </w:drawing>
       </w:r>
     </w:p>
     <w:p>
@@ -4358,11 +4366,43 @@
     <w:p>
       <w:r>
         <w:rPr>
-          <w:rFonts w:ascii="Times New Roman" w:hAnsi="Times New Roman"/>
           <w:noProof/>
-          <w:sz w:val="22"/>
         </w:rPr>
-        <w:t>The runlinc AI Assistant follows a ReAct-style reason–act loop with schema-validated tools [11], [12], [13]. Thought Log entries support auditability and human review [16], [27]. Figure 5 shows the agent sequence and dashboard wireframe.</w:t>
+        <w:drawing>
+          <wp:inline distT="0" distB="0" distL="0" distR="0" wp14:anchorId="2FF56578" wp14:editId="74427F50">
+            <wp:extent cx="5943600" cy="2953976"/>
+            <wp:effectExtent l="0" t="0" r="0" b="0"/>
+            <wp:docPr id="5" name="Picture 5"/>
+            <wp:cNvGraphicFramePr>
+              <a:graphicFrameLocks xmlns:a="http://schemas.openxmlformats.org/drawingml/2006/main" noChangeAspect="1"/>
+            </wp:cNvGraphicFramePr>
+            <a:graphic xmlns:a="http://schemas.openxmlformats.org/drawingml/2006/main">
+              <a:graphicData uri="http://schemas.openxmlformats.org/drawingml/2006/picture">
+                <pic:pic xmlns:pic="http://schemas.openxmlformats.org/drawingml/2006/picture">
+                  <pic:nvPicPr>
+                    <pic:cNvPr id="0" name="Fig5_Agent_Sequence_Dashboard.png"/>
+                    <pic:cNvPicPr/>
+                  </pic:nvPicPr>
+                  <pic:blipFill>
+                    <a:blip r:embed="rId10"/>
+                    <a:stretch>
+                      <a:fillRect/>
+                    </a:stretch>
+                  </pic:blipFill>
+                  <pic:spPr>
+                    <a:xfrm>
+                      <a:off x="0" y="0"/>
+                      <a:ext cx="5943600" cy="2953976"/>
+                    </a:xfrm>
+                    <a:prstGeom prst="rect">
+                      <a:avLst/>
+                    </a:prstGeom>
+                  </pic:spPr>
+                </pic:pic>
+              </a:graphicData>
+            </a:graphic>
+          </wp:inline>
+        </w:drawing>
       </w:r>
     </w:p>
     <w:p>
@@ -4377,7 +4417,6 @@
         <w:t>Figure 5. Agent sequence and Thought Log dashboard wireframe.</w:t>
       </w:r>
     </w:p>
-    <w:p/>
     <w:p>
       <w:pPr>
         <w:pStyle w:val="Heading2"/>
@@ -4391,23 +4430,19 @@
         <w:spacing w:after="120"/>
       </w:pPr>
       <w:r>
-        <w:rPr>
-          <w:rFonts w:ascii="Times New Roman" w:hAnsi="Times New Roman"/>
-          <w:sz w:val="22"/>
-        </w:rPr>
-        <w:t>As a preliminary hardware smoke test, the team completed runlinc intermediate Project 14 (DS18B20 Temperature Sensor) on the client-supplied STEMSEL E32W [33], [34]. The sensor was connected on ESP32 port D4 (tempSensor) via the runlinc IDE; a live reading of 23.125 °C was obtained using MicroPython/JS loop execution [35]. This confirms E32W power, runlinc connectivity, and basic sensor I/O before vibration (KY-002) integration [7], [8]. Figures 6–8 show the lab hardware, runlinc project screen, and temperature graph. Table 7 summarises the test record; meeting notes are in Appendix II.A.</w:t>
+        <w:t>As a preliminary hardware smoke test, the team completed runlinc intermediate Project 14 (DS18B20 Temperature Sensor) on the client-supplied STEMSEL E32W. The sensor was connected on ESP32 port D4 (tempSensor) via the runlinc IDE; a live reading of 23.125 °C was obtained. This confirms E32W power, runlinc connectivity, MicroPython/JS loop execution, and basic sensor I/O before vibration (KY-002) integration. Figures 6–8 show the lab hardware, runlinc project screen, and temperature graph. Table 7 summarises the test record; meeting notes are in Appendix II.A.</w:t>
       </w:r>
     </w:p>
     <w:tbl>
       <w:tblPr>
         <w:tblStyle w:val="TableGrid"/>
-        <w:tblW w:w="0" w:type="auto"/>
+        <w:tblW w:w="8931" w:type="dxa"/>
         <w:jc w:val="center"/>
         <w:tblLook w:val="04A0" w:firstRow="1" w:lastRow="0" w:firstColumn="1" w:lastColumn="0" w:noHBand="0" w:noVBand="1"/>
       </w:tblPr>
       <w:tblGrid>
         <w:gridCol w:w="4320"/>
-        <w:gridCol w:w="4320"/>
+        <w:gridCol w:w="4611"/>
       </w:tblGrid>
       <w:tr>
         <w:trPr>
@@ -4428,7 +4463,7 @@
         </w:tc>
         <w:tc>
           <w:tcPr>
-            <w:tcW w:w="4320" w:type="dxa"/>
+            <w:tcW w:w="4611" w:type="dxa"/>
           </w:tcPr>
           <w:p>
             <w:r>
@@ -4456,7 +4491,7 @@
         </w:tc>
         <w:tc>
           <w:tcPr>
-            <w:tcW w:w="4320" w:type="dxa"/>
+            <w:tcW w:w="4611" w:type="dxa"/>
           </w:tcPr>
           <w:p>
             <w:r>
@@ -4481,7 +4516,7 @@
         </w:tc>
         <w:tc>
           <w:tcPr>
-            <w:tcW w:w="4320" w:type="dxa"/>
+            <w:tcW w:w="4611" w:type="dxa"/>
           </w:tcPr>
           <w:p>
             <w:r>
@@ -4506,7 +4541,7 @@
         </w:tc>
         <w:tc>
           <w:tcPr>
-            <w:tcW w:w="4320" w:type="dxa"/>
+            <w:tcW w:w="4611" w:type="dxa"/>
           </w:tcPr>
           <w:p>
             <w:r>
@@ -4531,7 +4566,7 @@
         </w:tc>
         <w:tc>
           <w:tcPr>
-            <w:tcW w:w="4320" w:type="dxa"/>
+            <w:tcW w:w="4611" w:type="dxa"/>
           </w:tcPr>
           <w:p>
             <w:r>
@@ -4556,7 +4591,7 @@
         </w:tc>
         <w:tc>
           <w:tcPr>
-            <w:tcW w:w="4320" w:type="dxa"/>
+            <w:tcW w:w="4611" w:type="dxa"/>
           </w:tcPr>
           <w:p>
             <w:r>
@@ -4581,7 +4616,7 @@
         </w:tc>
         <w:tc>
           <w:tcPr>
-            <w:tcW w:w="4320" w:type="dxa"/>
+            <w:tcW w:w="4611" w:type="dxa"/>
           </w:tcPr>
           <w:p>
             <w:r>
@@ -4606,7 +4641,7 @@
         </w:tc>
         <w:tc>
           <w:tcPr>
-            <w:tcW w:w="4320" w:type="dxa"/>
+            <w:tcW w:w="4611" w:type="dxa"/>
           </w:tcPr>
           <w:p>
             <w:r>
@@ -4631,7 +4666,7 @@
         </w:tc>
         <w:tc>
           <w:tcPr>
-            <w:tcW w:w="4320" w:type="dxa"/>
+            <w:tcW w:w="4611" w:type="dxa"/>
           </w:tcPr>
           <w:p>
             <w:r>
@@ -4656,15 +4691,11 @@
         </w:tc>
         <w:tc>
           <w:tcPr>
-            <w:tcW w:w="4320" w:type="dxa"/>
-          </w:tcPr>
-          <w:p>
-            <w:r>
-              <w:t xml:space="preserve">Add KY-002 vibration (GPIO 23), buzzer </w:t>
-            </w:r>
-            <w:r>
-              <w:lastRenderedPageBreak/>
-              <w:t>(GPIO 34), MQTT feature publish</w:t>
+            <w:tcW w:w="4611" w:type="dxa"/>
+          </w:tcPr>
+          <w:p>
+            <w:r>
+              <w:t>Add KY-002 vibration (GPIO 23), buzzer (GPIO 34), MQTT feature publish</w:t>
             </w:r>
           </w:p>
         </w:tc>
@@ -6510,9 +6541,9 @@
         </w:rPr>
         <w:lastRenderedPageBreak/>
         <w:drawing>
-          <wp:inline distT="0" distB="0" distL="0" distR="0" wp14:anchorId="6A96AD11" wp14:editId="317A4FF3">
-            <wp:extent cx="5669280" cy="4994610"/>
-            <wp:effectExtent l="0" t="0" r="0" b="0"/>
+          <wp:inline distT="0" distB="0" distL="0" distR="0" wp14:anchorId="6A96AD11" wp14:editId="3E5E84A6">
+            <wp:extent cx="5668900" cy="4719955"/>
+            <wp:effectExtent l="0" t="0" r="0" b="4445"/>
             <wp:docPr id="11" name="Picture 11"/>
             <wp:cNvGraphicFramePr>
               <a:graphicFrameLocks xmlns:a="http://schemas.openxmlformats.org/drawingml/2006/main" noChangeAspect="1"/>
@@ -6524,20 +6555,29 @@
                     <pic:cNvPr id="0" name="02_WBS_Entry_Table.png"/>
                     <pic:cNvPicPr/>
                   </pic:nvPicPr>
-                  <pic:blipFill>
+                  <pic:blipFill rotWithShape="1">
                     <a:blip r:embed="rId19"/>
+                    <a:srcRect t="5493"/>
                     <a:stretch>
                       <a:fillRect/>
                     </a:stretch>
                   </pic:blipFill>
-                  <pic:spPr>
+                  <pic:spPr bwMode="auto">
                     <a:xfrm>
                       <a:off x="0" y="0"/>
-                      <a:ext cx="5669280" cy="4994610"/>
+                      <a:ext cx="5669280" cy="4720272"/>
                     </a:xfrm>
                     <a:prstGeom prst="rect">
                       <a:avLst/>
                     </a:prstGeom>
+                    <a:ln>
+                      <a:noFill/>
+                    </a:ln>
+                    <a:extLst>
+                      <a:ext uri="{53640926-AAD7-44D8-BBD7-CCE9431645EC}">
+                        <a14:shadowObscured xmlns:a14="http://schemas.microsoft.com/office/drawing/2010/main"/>
+                      </a:ext>
+                    </a:extLst>
                   </pic:spPr>
                 </pic:pic>
               </a:graphicData>
@@ -6848,11 +6888,7 @@
         <w:spacing w:after="120"/>
       </w:pPr>
       <w:r>
-        <w:rPr>
-          <w:rFonts w:ascii="Times New Roman" w:hAnsi="Times New Roman"/>
-          <w:sz w:val="22"/>
-        </w:rPr>
-        <w:t>The client supplies the E32W platform, 37-in-1 sensor kit, and USB data/power cable [33], [34]. The team funds only minor prototyping accessories. Student labour (~400 h, 4 × ~100 h) and supervisor/client input are recorded as in-kind with zero direct cash cost.</w:t>
+        <w:t>The client supplies the E32W platform, 37-in-1 sensor kit, and USB data/power cable. The team funds only minor prototyping accessories. Student labour (~400 h, 4 × ~100 h) and supervisor/client input are recorded as in-kind with zero direct cash cost.</w:t>
       </w:r>
     </w:p>
     <w:tbl>
@@ -6963,8 +6999,21 @@
           </w:tcPr>
           <w:p>
             <w:r>
+              <w:t>Hardware</w:t>
+            </w:r>
+          </w:p>
+        </w:tc>
+        <w:tc>
+          <w:tcPr>
+            <w:tcW w:w="1440" w:type="dxa"/>
+          </w:tcPr>
+          <w:p>
+            <w:r>
+              <w:t xml:space="preserve">STEMSEL E32W </w:t>
+            </w:r>
+            <w:r>
               <w:lastRenderedPageBreak/>
-              <w:t>Hardware</w:t>
+              <w:t>(ESP32)</w:t>
             </w:r>
           </w:p>
         </w:tc>
@@ -6974,16 +7023,7 @@
           </w:tcPr>
           <w:p>
             <w:r>
-              <w:t>STEMSEL E32W (ESP32)</w:t>
-            </w:r>
-          </w:p>
-        </w:tc>
-        <w:tc>
-          <w:tcPr>
-            <w:tcW w:w="1440" w:type="dxa"/>
-          </w:tcPr>
-          <w:p>
-            <w:r>
+              <w:lastRenderedPageBreak/>
               <w:t>1</w:t>
             </w:r>
           </w:p>
@@ -7992,11 +8032,10 @@
         <w:rPr>
           <w:noProof/>
         </w:rPr>
-        <w:lastRenderedPageBreak/>
         <w:drawing>
-          <wp:inline distT="0" distB="0" distL="0" distR="0" wp14:anchorId="3C59F0E6" wp14:editId="617B764D">
-            <wp:extent cx="5029200" cy="2588715"/>
-            <wp:effectExtent l="0" t="0" r="0" b="0"/>
+          <wp:inline distT="0" distB="0" distL="0" distR="0" wp14:anchorId="3C59F0E6" wp14:editId="6F3BD55B">
+            <wp:extent cx="5028316" cy="2280690"/>
+            <wp:effectExtent l="0" t="0" r="1270" b="5715"/>
             <wp:docPr id="12" name="Picture 12"/>
             <wp:cNvGraphicFramePr>
               <a:graphicFrameLocks xmlns:a="http://schemas.openxmlformats.org/drawingml/2006/main" noChangeAspect="1"/>
@@ -8008,20 +8047,29 @@
                     <pic:cNvPr id="0" name="03_Budget_Cost_Table.png"/>
                     <pic:cNvPicPr/>
                   </pic:nvPicPr>
-                  <pic:blipFill>
+                  <pic:blipFill rotWithShape="1">
                     <a:blip r:embed="rId20"/>
+                    <a:srcRect t="11883"/>
                     <a:stretch>
                       <a:fillRect/>
                     </a:stretch>
                   </pic:blipFill>
-                  <pic:spPr>
+                  <pic:spPr bwMode="auto">
                     <a:xfrm>
                       <a:off x="0" y="0"/>
-                      <a:ext cx="5029200" cy="2588715"/>
+                      <a:ext cx="5029200" cy="2281091"/>
                     </a:xfrm>
                     <a:prstGeom prst="rect">
                       <a:avLst/>
                     </a:prstGeom>
+                    <a:ln>
+                      <a:noFill/>
+                    </a:ln>
+                    <a:extLst>
+                      <a:ext uri="{53640926-AAD7-44D8-BBD7-CCE9431645EC}">
+                        <a14:shadowObscured xmlns:a14="http://schemas.microsoft.com/office/drawing/2010/main"/>
+                      </a:ext>
+                    </a:extLst>
                   </pic:spPr>
                 </pic:pic>
               </a:graphicData>
@@ -8039,6 +8087,7 @@
           <w:i/>
           <w:sz w:val="20"/>
         </w:rPr>
+        <w:lastRenderedPageBreak/>
         <w:t>Figure 15. ProjectLibre WBS 5 cost table (minimum direct budget AUD 18.45).</w:t>
       </w:r>
     </w:p>
@@ -8049,9 +8098,9 @@
           <w:noProof/>
         </w:rPr>
         <w:drawing>
-          <wp:inline distT="0" distB="0" distL="0" distR="0" wp14:anchorId="58766481" wp14:editId="50FA7E5B">
-            <wp:extent cx="4114800" cy="1934396"/>
-            <wp:effectExtent l="0" t="0" r="0" b="0"/>
+          <wp:inline distT="0" distB="0" distL="0" distR="0" wp14:anchorId="58766481" wp14:editId="5A6DDCC3">
+            <wp:extent cx="4114404" cy="1601701"/>
+            <wp:effectExtent l="0" t="0" r="635" b="0"/>
             <wp:docPr id="13" name="Picture 13"/>
             <wp:cNvGraphicFramePr>
               <a:graphicFrameLocks xmlns:a="http://schemas.openxmlformats.org/drawingml/2006/main" noChangeAspect="1"/>
@@ -8063,20 +8112,29 @@
                     <pic:cNvPr id="0" name="04_Resource_Sheet.png"/>
                     <pic:cNvPicPr/>
                   </pic:nvPicPr>
-                  <pic:blipFill>
+                  <pic:blipFill rotWithShape="1">
                     <a:blip r:embed="rId21"/>
+                    <a:srcRect t="17191"/>
                     <a:stretch>
                       <a:fillRect/>
                     </a:stretch>
                   </pic:blipFill>
-                  <pic:spPr>
+                  <pic:spPr bwMode="auto">
                     <a:xfrm>
                       <a:off x="0" y="0"/>
-                      <a:ext cx="4114800" cy="1934396"/>
+                      <a:ext cx="4114800" cy="1601855"/>
                     </a:xfrm>
                     <a:prstGeom prst="rect">
                       <a:avLst/>
                     </a:prstGeom>
+                    <a:ln>
+                      <a:noFill/>
+                    </a:ln>
+                    <a:extLst>
+                      <a:ext uri="{53640926-AAD7-44D8-BBD7-CCE9431645EC}">
+                        <a14:shadowObscured xmlns:a14="http://schemas.microsoft.com/office/drawing/2010/main"/>
+                      </a:ext>
+                    </a:extLst>
                   </pic:spPr>
                 </pic:pic>
               </a:graphicData>
@@ -8103,11 +8161,10 @@
         <w:rPr>
           <w:noProof/>
         </w:rPr>
-        <w:lastRenderedPageBreak/>
         <w:drawing>
-          <wp:inline distT="0" distB="0" distL="0" distR="0" wp14:anchorId="34CE4C90" wp14:editId="695C128B">
-            <wp:extent cx="4572000" cy="3035532"/>
-            <wp:effectExtent l="0" t="0" r="0" b="0"/>
+          <wp:inline distT="0" distB="0" distL="0" distR="0" wp14:anchorId="34CE4C90" wp14:editId="7E5ABDFF">
+            <wp:extent cx="4571651" cy="2603039"/>
+            <wp:effectExtent l="0" t="0" r="635" b="635"/>
             <wp:docPr id="14" name="Picture 14"/>
             <wp:cNvGraphicFramePr>
               <a:graphicFrameLocks xmlns:a="http://schemas.openxmlformats.org/drawingml/2006/main" noChangeAspect="1"/>
@@ -8119,20 +8176,29 @@
                     <pic:cNvPr id="0" name="05_Project_Information.png"/>
                     <pic:cNvPicPr/>
                   </pic:nvPicPr>
-                  <pic:blipFill>
+                  <pic:blipFill rotWithShape="1">
                     <a:blip r:embed="rId22"/>
+                    <a:srcRect t="14241"/>
                     <a:stretch>
                       <a:fillRect/>
                     </a:stretch>
                   </pic:blipFill>
-                  <pic:spPr>
+                  <pic:spPr bwMode="auto">
                     <a:xfrm>
                       <a:off x="0" y="0"/>
-                      <a:ext cx="4572000" cy="3035532"/>
+                      <a:ext cx="4572000" cy="2603238"/>
                     </a:xfrm>
                     <a:prstGeom prst="rect">
                       <a:avLst/>
                     </a:prstGeom>
+                    <a:ln>
+                      <a:noFill/>
+                    </a:ln>
+                    <a:extLst>
+                      <a:ext uri="{53640926-AAD7-44D8-BBD7-CCE9431645EC}">
+                        <a14:shadowObscured xmlns:a14="http://schemas.microsoft.com/office/drawing/2010/main"/>
+                      </a:ext>
+                    </a:extLst>
                   </pic:spPr>
                 </pic:pic>
               </a:graphicData>
@@ -8342,7 +8408,11 @@
           </w:tcPr>
           <w:p>
             <w:r>
-              <w:t>Lab sensor data may not represent factory conditions</w:t>
+              <w:t xml:space="preserve">Lab sensor data may not represent factory </w:t>
+            </w:r>
+            <w:r>
+              <w:lastRenderedPageBreak/>
+              <w:t>conditions</w:t>
             </w:r>
           </w:p>
         </w:tc>
@@ -8352,7 +8422,12 @@
           </w:tcPr>
           <w:p>
             <w:r>
-              <w:t>Document test protocol; compare with published ESP32 studies [7, 8]</w:t>
+              <w:lastRenderedPageBreak/>
+              <w:t xml:space="preserve">Document test protocol; compare </w:t>
+            </w:r>
+            <w:r>
+              <w:lastRenderedPageBreak/>
+              <w:t>with published ESP32 studies [7, 8]</w:t>
             </w:r>
           </w:p>
         </w:tc>
@@ -8362,6 +8437,7 @@
           </w:tcPr>
           <w:p>
             <w:r>
+              <w:lastRenderedPageBreak/>
               <w:t>Asmita</w:t>
             </w:r>
           </w:p>
@@ -8509,11 +8585,7 @@
         <w:spacing w:after="120"/>
       </w:pPr>
       <w:r>
-        <w:rPr>
-          <w:rFonts w:ascii="Times New Roman" w:hAnsi="Times New Roman"/>
-          <w:sz w:val="22"/>
-        </w:rPr>
-        <w:t>Limitations: team lab data on E32W may not fully represent factory operating conditions [1], [7]; ESP32 memory limits FFT and model size [30], [34], [40]; agent latency is unsuitable for safety alarms relative to millisecond reflex paths [11], [15], [29]; ERP integration is simulated [12], [13]; primary data depends on the team-led lab collection schedule [33].</w:t>
+        <w:t>Limitations: team lab data on E32W may not fully represent factory operating conditions; ESP32 memory limits FFT; agent latency unsuitable for safety alarms; ERP simulated; primary data depends on team-led lab collection schedule.</w:t>
       </w:r>
     </w:p>
     <w:p>
@@ -8529,11 +8601,7 @@
         <w:spacing w:after="120"/>
       </w:pPr>
       <w:r>
-        <w:rPr>
-          <w:rFonts w:ascii="Times New Roman" w:hAnsi="Times New Roman"/>
-          <w:sz w:val="22"/>
-        </w:rPr>
-        <w:t>This Assignment 2 report responds directly to Assignment 1b feedback: project-specific introduction, corrected and aligned RQs/objectives, critical literature synthesis [1], [2], [7], [11], documented client engagement (meetings 10, 17, 24 August 2026), and team hardware data collection scope [33]. The four-layer architecture (Figure 1) separates millisecond reflex alarms [29] from agentic reasoning [11], [13]. Next steps: complete sensor wiring, live MQTT streaming [22], RUL baseline [4], and agent integration in MDA692.</w:t>
+        <w:t>This Assignment 2 report responds directly to Assignment 1b feedback: project-specific introduction, corrected and aligned RQs/objectives, critical literature synthesis, documented client engagement (meetings 10, 17, 24 August 2026), and team hardware data collection scope. The four-layer architecture (Figure 1) separates millisecond reflex alarms from agentic reasoning. Next steps: complete sensor wiring, live MQTT streaming, RUL baseline, and agent integration in MDA692.</w:t>
       </w:r>
     </w:p>
     <w:p>
@@ -8549,38 +8617,11 @@
         <w:ind w:left="720" w:hanging="720"/>
       </w:pPr>
       <w:r>
-        <w:rPr>
-          <w:rFonts w:ascii="Times New Roman" w:hAnsi="Times New Roman"/>
-          <w:sz w:val="22"/>
-        </w:rPr>
         <w:t>[1]</w:t>
+      </w:r>
+      <w:r>
         <w:tab/>
-        <w:t xml:space="preserve">T. Zonta, C. A. da Costa, R. da Rosa Righi, M. J. de Lima, E. S. da Trindade, and G. P. Li, “Predictive maintenance in the Industry 4.0: A systematic literature review,” Computers &amp; Industrial Engineering, vol. 150, art. no. 106889, Dec. 2020, </w:t>
-      </w:r>
-      <w:r>
-        <w:rPr>
-          <w:rFonts w:ascii="Times New Roman" w:hAnsi="Times New Roman"/>
-          <w:sz w:val="22"/>
-        </w:rPr>
-        <w:t xml:space="preserve">doi: </w:t>
-      </w:r>
-      <w:hyperlink r:id="rId25">
-        <w:r>
-          <w:rPr>
-            <w:color w:val="0563C1"/>
-            <w:u w:val="single"/>
-            <w:sz w:val="22"/>
-            <w:rFonts w:ascii="Times New Roman" w:hAnsi="Times New Roman"/>
-          </w:rPr>
-          <w:t xml:space="preserve">10.1016/j.cie.2020.106889</w:t>
-        </w:r>
-      </w:hyperlink>
-      <w:r>
-        <w:rPr>
-          <w:rFonts w:ascii="Times New Roman" w:hAnsi="Times New Roman"/>
-          <w:sz w:val="22"/>
-        </w:rPr>
-        <w:t>.</w:t>
+        <w:t>T. Zonta, C. A. da Costa, R. da Rosa Righi, M. J. de Lima, E. S. da Trindade, and G. P. Li, “Predictive maintenance in the Industry 4.0: A systematic literature review,” Computers &amp; Industrial Engineering, vol. 150, art. no. 106889, Dec. 2020, doi: 10.1016/j.cie.2020.106889.</w:t>
       </w:r>
     </w:p>
     <w:p>
@@ -8588,38 +8629,11 @@
         <w:ind w:left="720" w:hanging="720"/>
       </w:pPr>
       <w:r>
-        <w:rPr>
-          <w:rFonts w:ascii="Times New Roman" w:hAnsi="Times New Roman"/>
-          <w:sz w:val="22"/>
-        </w:rPr>
         <w:t>[2]</w:t>
+      </w:r>
+      <w:r>
         <w:tab/>
-        <w:t xml:space="preserve">F. Wu, Q. Wu, Y. Tan, and X. Xu, “Remaining useful life prediction based on deep learning: A survey,” Sensors, vol. 24, no. 11, art. no. 3454, May 2024, </w:t>
-      </w:r>
-      <w:r>
-        <w:rPr>
-          <w:rFonts w:ascii="Times New Roman" w:hAnsi="Times New Roman"/>
-          <w:sz w:val="22"/>
-        </w:rPr>
-        <w:t xml:space="preserve">doi: </w:t>
-      </w:r>
-      <w:hyperlink r:id="rId26">
-        <w:r>
-          <w:rPr>
-            <w:color w:val="0563C1"/>
-            <w:u w:val="single"/>
-            <w:sz w:val="22"/>
-            <w:rFonts w:ascii="Times New Roman" w:hAnsi="Times New Roman"/>
-          </w:rPr>
-          <w:t xml:space="preserve">10.3390/s24113454</w:t>
-        </w:r>
-      </w:hyperlink>
-      <w:r>
-        <w:rPr>
-          <w:rFonts w:ascii="Times New Roman" w:hAnsi="Times New Roman"/>
-          <w:sz w:val="22"/>
-        </w:rPr>
-        <w:t>.</w:t>
+        <w:t>F. Wu, Q. Wu, Y. Tan, and X. Xu, “Remaining useful life prediction based on deep learning: A survey,” Sensors, vol. 24, no. 11, art. no. 3454, May 2024, doi: 10.3390/s24113454.</w:t>
       </w:r>
     </w:p>
     <w:p>
@@ -8627,38 +8641,11 @@
         <w:ind w:left="720" w:hanging="720"/>
       </w:pPr>
       <w:r>
-        <w:rPr>
-          <w:rFonts w:ascii="Times New Roman" w:hAnsi="Times New Roman"/>
-          <w:sz w:val="22"/>
-        </w:rPr>
         <w:t>[3]</w:t>
+      </w:r>
+      <w:r>
         <w:tab/>
-        <w:t xml:space="preserve">A. Saxena, K. Goebel, D. Simon, and N. Eklund, “Damage propagation modeling for aircraft engine run-to-failure simulation,” in Proc. Int. Conf. Prognostics and Health Management (PHM), Denver, CO, USA, Oct. 2008, pp. 1–9, </w:t>
-      </w:r>
-      <w:r>
-        <w:rPr>
-          <w:rFonts w:ascii="Times New Roman" w:hAnsi="Times New Roman"/>
-          <w:sz w:val="22"/>
-        </w:rPr>
-        <w:t xml:space="preserve">doi: </w:t>
-      </w:r>
-      <w:hyperlink r:id="rId27">
-        <w:r>
-          <w:rPr>
-            <w:color w:val="0563C1"/>
-            <w:u w:val="single"/>
-            <w:sz w:val="22"/>
-            <w:rFonts w:ascii="Times New Roman" w:hAnsi="Times New Roman"/>
-          </w:rPr>
-          <w:t xml:space="preserve">10.1109/PHM.2008.4711414</w:t>
-        </w:r>
-      </w:hyperlink>
-      <w:r>
-        <w:rPr>
-          <w:rFonts w:ascii="Times New Roman" w:hAnsi="Times New Roman"/>
-          <w:sz w:val="22"/>
-        </w:rPr>
-        <w:t>.</w:t>
+        <w:t>A. Saxena, K. Goebel, D. Simon, and N. Eklund, “Damage propagation modeling for aircraft engine run-to-failure simulation,” in Proc. Int. Conf. Prognostics and Health Management (PHM), Denver, CO, USA, Oct. 2008, pp. 1–9, doi: 10.1109/PHM.2008.4711414.</w:t>
       </w:r>
     </w:p>
     <w:p>
@@ -8666,38 +8653,11 @@
         <w:ind w:left="720" w:hanging="720"/>
       </w:pPr>
       <w:r>
-        <w:rPr>
-          <w:rFonts w:ascii="Times New Roman" w:hAnsi="Times New Roman"/>
-          <w:sz w:val="22"/>
-        </w:rPr>
         <w:t>[4]</w:t>
+      </w:r>
+      <w:r>
         <w:tab/>
-        <w:t xml:space="preserve">S. Zheng, K. Ristovski, A. Farahat, and C. Gupta, “Long short-term memory network for remaining useful life estimation,” in Proc. IEEE Int. Conf. Prognostics and Health Management (ICPHM), Dallas, TX, USA, Jun. 2017, pp. 88–95, </w:t>
-      </w:r>
-      <w:r>
-        <w:rPr>
-          <w:rFonts w:ascii="Times New Roman" w:hAnsi="Times New Roman"/>
-          <w:sz w:val="22"/>
-        </w:rPr>
-        <w:t xml:space="preserve">doi: </w:t>
-      </w:r>
-      <w:hyperlink r:id="rId28">
-        <w:r>
-          <w:rPr>
-            <w:color w:val="0563C1"/>
-            <w:u w:val="single"/>
-            <w:sz w:val="22"/>
-            <w:rFonts w:ascii="Times New Roman" w:hAnsi="Times New Roman"/>
-          </w:rPr>
-          <w:t xml:space="preserve">10.1109/ICPHM.2017.7998311</w:t>
-        </w:r>
-      </w:hyperlink>
-      <w:r>
-        <w:rPr>
-          <w:rFonts w:ascii="Times New Roman" w:hAnsi="Times New Roman"/>
-          <w:sz w:val="22"/>
-        </w:rPr>
-        <w:t>.</w:t>
+        <w:t>S. Zheng, K. Ristovski, A. Farahat, and C. Gupta, “Long short-term memory network for remaining useful life estimation,” in Proc. IEEE Int. Conf. Prognostics and Health Management (ICPHM), Dallas, TX, USA, Jun. 2017, pp. 88–95, doi: 10.1109/ICPHM.2017.7998311.</w:t>
       </w:r>
     </w:p>
     <w:p>
@@ -8705,38 +8665,12 @@
         <w:ind w:left="720" w:hanging="720"/>
       </w:pPr>
       <w:r>
-        <w:rPr>
-          <w:rFonts w:ascii="Times New Roman" w:hAnsi="Times New Roman"/>
-          <w:sz w:val="22"/>
-        </w:rPr>
+        <w:lastRenderedPageBreak/>
         <w:t>[5]</w:t>
+      </w:r>
+      <w:r>
         <w:tab/>
-        <w:t xml:space="preserve">B. Wang, Y. Lei, N. Li, and N. Li, “A hybrid prognostics approach for estimating remaining useful life of rolling element bearings,” IEEE Transactions on Reliability, vol. 69, no. 1, pp. 401–412, Mar. 2020, </w:t>
-      </w:r>
-      <w:r>
-        <w:rPr>
-          <w:rFonts w:ascii="Times New Roman" w:hAnsi="Times New Roman"/>
-          <w:sz w:val="22"/>
-        </w:rPr>
-        <w:t xml:space="preserve">doi: </w:t>
-      </w:r>
-      <w:hyperlink r:id="rId29">
-        <w:r>
-          <w:rPr>
-            <w:color w:val="0563C1"/>
-            <w:u w:val="single"/>
-            <w:sz w:val="22"/>
-            <w:rFonts w:ascii="Times New Roman" w:hAnsi="Times New Roman"/>
-          </w:rPr>
-          <w:t xml:space="preserve">10.1109/TR.2018.2882682</w:t>
-        </w:r>
-      </w:hyperlink>
-      <w:r>
-        <w:rPr>
-          <w:rFonts w:ascii="Times New Roman" w:hAnsi="Times New Roman"/>
-          <w:sz w:val="22"/>
-        </w:rPr>
-        <w:t>.</w:t>
+        <w:t>B. Wang, Y. Lei, N. Li, and N. Li, “A hybrid prognostics approach for estimating remaining useful life of rolling element bearings,” IEEE Transactions on Reliability, vol. 69, no. 1, pp. 401–412, Mar. 2020, doi: 10.1109/TR.2018.2882682.</w:t>
       </w:r>
     </w:p>
     <w:p>
@@ -8744,38 +8678,11 @@
         <w:ind w:left="720" w:hanging="720"/>
       </w:pPr>
       <w:r>
-        <w:rPr>
-          <w:rFonts w:ascii="Times New Roman" w:hAnsi="Times New Roman"/>
-          <w:sz w:val="22"/>
-        </w:rPr>
         <w:t>[6]</w:t>
+      </w:r>
+      <w:r>
         <w:tab/>
-        <w:t xml:space="preserve">W. A. Smith and R. B. Randall, “Rolling element bearing diagnostics using the Case Western Reserve University data: A benchmark study,” Mechanical Systems and Signal Processing, vol. 64–65, pp. 100–131, Dec. 2015, </w:t>
-      </w:r>
-      <w:r>
-        <w:rPr>
-          <w:rFonts w:ascii="Times New Roman" w:hAnsi="Times New Roman"/>
-          <w:sz w:val="22"/>
-        </w:rPr>
-        <w:t xml:space="preserve">doi: </w:t>
-      </w:r>
-      <w:hyperlink r:id="rId30">
-        <w:r>
-          <w:rPr>
-            <w:color w:val="0563C1"/>
-            <w:u w:val="single"/>
-            <w:sz w:val="22"/>
-            <w:rFonts w:ascii="Times New Roman" w:hAnsi="Times New Roman"/>
-          </w:rPr>
-          <w:t xml:space="preserve">10.1016/j.ymssp.2015.04.021</w:t>
-        </w:r>
-      </w:hyperlink>
-      <w:r>
-        <w:rPr>
-          <w:rFonts w:ascii="Times New Roman" w:hAnsi="Times New Roman"/>
-          <w:sz w:val="22"/>
-        </w:rPr>
-        <w:t>.</w:t>
+        <w:t>W. A. Smith and R. B. Randall, “Rolling element bearing diagnostics using the Case Western Reserve University data: A benchmark study,” Mechanical Systems and Signal Processing, vol. 64–65, pp. 100–131, Dec. 2015, doi: 10.1016/j.ymssp.2015.04.021.</w:t>
       </w:r>
     </w:p>
     <w:p>
@@ -8783,38 +8690,11 @@
         <w:ind w:left="720" w:hanging="720"/>
       </w:pPr>
       <w:r>
-        <w:rPr>
-          <w:rFonts w:ascii="Times New Roman" w:hAnsi="Times New Roman"/>
-          <w:sz w:val="22"/>
-        </w:rPr>
         <w:t>[7]</w:t>
+      </w:r>
+      <w:r>
         <w:tab/>
-        <w:t xml:space="preserve">P. Kolok, M. Hodoň, P. Ševčík, L. Hotz, and N. Remy, “Low-cost IoT-based predictive maintenance using vibration,” Sensors, vol. 25, no. 21, art. no. 6610, Oct. 2025, </w:t>
-      </w:r>
-      <w:r>
-        <w:rPr>
-          <w:rFonts w:ascii="Times New Roman" w:hAnsi="Times New Roman"/>
-          <w:sz w:val="22"/>
-        </w:rPr>
-        <w:t xml:space="preserve">doi: </w:t>
-      </w:r>
-      <w:hyperlink r:id="rId31">
-        <w:r>
-          <w:rPr>
-            <w:color w:val="0563C1"/>
-            <w:u w:val="single"/>
-            <w:sz w:val="22"/>
-            <w:rFonts w:ascii="Times New Roman" w:hAnsi="Times New Roman"/>
-          </w:rPr>
-          <w:t xml:space="preserve">10.3390/s25216610</w:t>
-        </w:r>
-      </w:hyperlink>
-      <w:r>
-        <w:rPr>
-          <w:rFonts w:ascii="Times New Roman" w:hAnsi="Times New Roman"/>
-          <w:sz w:val="22"/>
-        </w:rPr>
-        <w:t>.</w:t>
+        <w:t>P. Kolok, M. Hodoň, P. Ševčík, L. Hotz, and N. Remy, “Low-cost IoT-based predictive maintenance using vibration,” Sensors, vol. 25, no. 21, art. no. 6610, Oct. 2025, doi: 10.3390/s25216610.</w:t>
       </w:r>
     </w:p>
     <w:p>
@@ -8822,38 +8702,11 @@
         <w:ind w:left="720" w:hanging="720"/>
       </w:pPr>
       <w:r>
-        <w:rPr>
-          <w:rFonts w:ascii="Times New Roman" w:hAnsi="Times New Roman"/>
-          <w:sz w:val="22"/>
-        </w:rPr>
         <w:t>[8]</w:t>
+      </w:r>
+      <w:r>
         <w:tab/>
-        <w:t xml:space="preserve">S. Brito, G. Azinheira, J. Semião, N. Sousa, and S. P. Litrán, “Non-intrusive low-cost IoT-based hardware system for sustainable predictive maintenance of industrial pump systems,” Electronics, vol. 14, no. 14, art. no. 2913, Jul. 2025, </w:t>
-      </w:r>
-      <w:r>
-        <w:rPr>
-          <w:rFonts w:ascii="Times New Roman" w:hAnsi="Times New Roman"/>
-          <w:sz w:val="22"/>
-        </w:rPr>
-        <w:t xml:space="preserve">doi: </w:t>
-      </w:r>
-      <w:hyperlink r:id="rId32">
-        <w:r>
-          <w:rPr>
-            <w:color w:val="0563C1"/>
-            <w:u w:val="single"/>
-            <w:sz w:val="22"/>
-            <w:rFonts w:ascii="Times New Roman" w:hAnsi="Times New Roman"/>
-          </w:rPr>
-          <w:t xml:space="preserve">10.3390/electronics14142913</w:t>
-        </w:r>
-      </w:hyperlink>
-      <w:r>
-        <w:rPr>
-          <w:rFonts w:ascii="Times New Roman" w:hAnsi="Times New Roman"/>
-          <w:sz w:val="22"/>
-        </w:rPr>
-        <w:t>.</w:t>
+        <w:t>S. Brito, G. Azinheira, J. Semião, N. Sousa, and S. P. Litrán, “Non-intrusive low-cost IoT-based hardware system for sustainable predictive maintenance of industrial pump systems,” Electronics, vol. 14, no. 14, art. no. 2913, Jul. 2025, doi: 10.3390/electronics14142913.</w:t>
       </w:r>
     </w:p>
     <w:p>
@@ -8861,38 +8714,11 @@
         <w:ind w:left="720" w:hanging="720"/>
       </w:pPr>
       <w:r>
-        <w:rPr>
-          <w:rFonts w:ascii="Times New Roman" w:hAnsi="Times New Roman"/>
-          <w:sz w:val="22"/>
-        </w:rPr>
         <w:t>[9]</w:t>
+      </w:r>
+      <w:r>
         <w:tab/>
-        <w:t xml:space="preserve">J. Jeleńska, U. Jachymczyk, P. Knap, and M. Wiszniewski, “Design and validation of low-cost MEMS sensor networks for AI-based predictive maintenance in Industry 4.0,” in Proc. IEEE Int. Conf. Metrology for eXtended Reality, Artificial Intelligence and Neural Engineering (MetroXRAINE), 2025, </w:t>
-      </w:r>
-      <w:r>
-        <w:rPr>
-          <w:rFonts w:ascii="Times New Roman" w:hAnsi="Times New Roman"/>
-          <w:sz w:val="22"/>
-        </w:rPr>
-        <w:t xml:space="preserve">doi: </w:t>
-      </w:r>
-      <w:hyperlink r:id="rId33">
-        <w:r>
-          <w:rPr>
-            <w:color w:val="0563C1"/>
-            <w:u w:val="single"/>
-            <w:sz w:val="22"/>
-            <w:rFonts w:ascii="Times New Roman" w:hAnsi="Times New Roman"/>
-          </w:rPr>
-          <w:t xml:space="preserve">10.1109/MetroXRAINE66377.2025.11340048</w:t>
-        </w:r>
-      </w:hyperlink>
-      <w:r>
-        <w:rPr>
-          <w:rFonts w:ascii="Times New Roman" w:hAnsi="Times New Roman"/>
-          <w:sz w:val="22"/>
-        </w:rPr>
-        <w:t>.</w:t>
+        <w:t>J. Jeleńska, U. Jachymczyk, P. Knap, and M. Wiszniewski, “Design and validation of low-cost MEMS sensor networks for AI-based predictive maintenance in Industry 4.0,” in Proc. IEEE Int. Conf. Metrology for eXtended Reality, Artificial Intelligence and Neural Engineering (MetroXRAINE), 2025, doi: 10.1109/MetroXRAINE66377.2025.11340048.</w:t>
       </w:r>
     </w:p>
     <w:p>
@@ -8900,38 +8726,11 @@
         <w:ind w:left="720" w:hanging="720"/>
       </w:pPr>
       <w:r>
-        <w:rPr>
-          <w:rFonts w:ascii="Times New Roman" w:hAnsi="Times New Roman"/>
-          <w:sz w:val="22"/>
-        </w:rPr>
         <w:t>[10]</w:t>
+      </w:r>
+      <w:r>
         <w:tab/>
-        <w:t xml:space="preserve">C. Banbury, V. J. Reddi, P. Torelli, J. Holleman, N. Jeffries, C. Kiraly, P. Montino, D. Kanter, S. Ahmed, D. Pau, et al., “MLPerf Tiny benchmark,” in Proc. Neural Information Processing Systems Track on Datasets and Benchmarks, 2021, </w:t>
-      </w:r>
-      <w:r>
-        <w:rPr>
-          <w:rFonts w:ascii="Times New Roman" w:hAnsi="Times New Roman"/>
-          <w:sz w:val="22"/>
-        </w:rPr>
-        <w:t xml:space="preserve">[Online]. Available: </w:t>
-      </w:r>
-      <w:hyperlink r:id="rId34">
-        <w:r>
-          <w:rPr>
-            <w:color w:val="0563C1"/>
-            <w:u w:val="single"/>
-            <w:sz w:val="22"/>
-            <w:rFonts w:ascii="Times New Roman" w:hAnsi="Times New Roman"/>
-          </w:rPr>
-          <w:t xml:space="preserve">https://mlcommons.org/benchmarks/inference-tiny/</w:t>
-        </w:r>
-      </w:hyperlink>
-      <w:r>
-        <w:rPr>
-          <w:rFonts w:ascii="Times New Roman" w:hAnsi="Times New Roman"/>
-          <w:sz w:val="22"/>
-        </w:rPr>
-        <w:t>.</w:t>
+        <w:t>C. Banbury, V. J. Reddi, P. Torelli, J. Holleman, N. Jeffries, C. Kiraly, P. Montino, D. Kanter, S. Ahmed, D. Pau, et al., “MLPerf Tiny benchmark,” in Proc. Neural Information Processing Systems Track on Datasets and Benchmarks, 2021. [Online]. Available: https://arxiv.org/abs/2106.07597</w:t>
       </w:r>
     </w:p>
     <w:p>
@@ -8939,38 +8738,11 @@
         <w:ind w:left="720" w:hanging="720"/>
       </w:pPr>
       <w:r>
-        <w:rPr>
-          <w:rFonts w:ascii="Times New Roman" w:hAnsi="Times New Roman"/>
-          <w:sz w:val="22"/>
-        </w:rPr>
         <w:t>[11]</w:t>
+      </w:r>
+      <w:r>
         <w:tab/>
-        <w:t xml:space="preserve">S. Yao, J. Zhao, D. Yu, N. Du, I. Shafran, K. Narasimhan, and Y. Cao, “ReAct: Synergizing reasoning and acting in language models,” in Proc. 11th Int. Conf. Learning Representations (ICLR), Kigali, Rwanda, May 2023, </w:t>
-      </w:r>
-      <w:r>
-        <w:rPr>
-          <w:rFonts w:ascii="Times New Roman" w:hAnsi="Times New Roman"/>
-          <w:sz w:val="22"/>
-        </w:rPr>
-        <w:t xml:space="preserve">[Online]. Available: </w:t>
-      </w:r>
-      <w:hyperlink r:id="rId35">
-        <w:r>
-          <w:rPr>
-            <w:color w:val="0563C1"/>
-            <w:u w:val="single"/>
-            <w:sz w:val="22"/>
-            <w:rFonts w:ascii="Times New Roman" w:hAnsi="Times New Roman"/>
-          </w:rPr>
-          <w:t xml:space="preserve">https://arxiv.org/abs/2210.03629</w:t>
-        </w:r>
-      </w:hyperlink>
-      <w:r>
-        <w:rPr>
-          <w:rFonts w:ascii="Times New Roman" w:hAnsi="Times New Roman"/>
-          <w:sz w:val="22"/>
-        </w:rPr>
-        <w:t>.</w:t>
+        <w:t>S. Yao, J. Zhao, D. Yu, N. Du, I. Shafran, K. Narasimhan, and Y. Cao, “ReAct: Synergizing reasoning and acting in language models,” in Proc. 11th Int. Conf. Learning Representations (ICLR), Kigali, Rwanda, May 2023. [Online]. Available: https://arxiv.org/abs/2210.03629</w:t>
       </w:r>
     </w:p>
     <w:p>
@@ -8978,38 +8750,11 @@
         <w:ind w:left="720" w:hanging="720"/>
       </w:pPr>
       <w:r>
-        <w:rPr>
-          <w:rFonts w:ascii="Times New Roman" w:hAnsi="Times New Roman"/>
-          <w:sz w:val="22"/>
-        </w:rPr>
         <w:t>[12]</w:t>
+      </w:r>
+      <w:r>
         <w:tab/>
-        <w:t xml:space="preserve">T. Schick, J. Dwivedi-Yu, R. Dessì, R. Raileanu, M. Lomeli, L. Zettlemoyer, N. Cancedda, and T. Scialom, “Toolformer: Language models can teach themselves to use tools,” in Proc. 37th Conf. Neural Information Processing Systems (NeurIPS), New Orleans, LA, USA, Dec. 2023, </w:t>
-      </w:r>
-      <w:r>
-        <w:rPr>
-          <w:rFonts w:ascii="Times New Roman" w:hAnsi="Times New Roman"/>
-          <w:sz w:val="22"/>
-        </w:rPr>
-        <w:t xml:space="preserve">[Online]. Available: </w:t>
-      </w:r>
-      <w:hyperlink r:id="rId36">
-        <w:r>
-          <w:rPr>
-            <w:color w:val="0563C1"/>
-            <w:u w:val="single"/>
-            <w:sz w:val="22"/>
-            <w:rFonts w:ascii="Times New Roman" w:hAnsi="Times New Roman"/>
-          </w:rPr>
-          <w:t xml:space="preserve">https://arxiv.org/abs/2302.04761</w:t>
-        </w:r>
-      </w:hyperlink>
-      <w:r>
-        <w:rPr>
-          <w:rFonts w:ascii="Times New Roman" w:hAnsi="Times New Roman"/>
-          <w:sz w:val="22"/>
-        </w:rPr>
-        <w:t>.</w:t>
+        <w:t>T. Schick, J. Dwivedi-Yu, R. Dessì, R. Raileanu, M. Lomeli, L. Zettlemoyer, N. Cancedda, and T. Scialom, “Toolformer: Language models can teach themselves to use tools,” in Proc. 37th Conf. Neural Information Processing Systems (NeurIPS), New Orleans, LA, USA, Dec. 2023.</w:t>
       </w:r>
     </w:p>
     <w:p>
@@ -9017,38 +8762,11 @@
         <w:ind w:left="720" w:hanging="720"/>
       </w:pPr>
       <w:r>
-        <w:rPr>
-          <w:rFonts w:ascii="Times New Roman" w:hAnsi="Times New Roman"/>
-          <w:sz w:val="22"/>
-        </w:rPr>
         <w:t>[13]</w:t>
+      </w:r>
+      <w:r>
         <w:tab/>
-        <w:t xml:space="preserve">J. T. Rayfield, S. Lin, N. Zhou, and D. C. Patel, “ReAct meets industrial IoT: Language agents for data access,” in Proc. 2025 Conf. Empirical Methods in Natural Language Processing: Industry Track, Suzhou, China, Nov. 2025, pp. 364–382, </w:t>
-      </w:r>
-      <w:r>
-        <w:rPr>
-          <w:rFonts w:ascii="Times New Roman" w:hAnsi="Times New Roman"/>
-          <w:sz w:val="22"/>
-        </w:rPr>
-        <w:t xml:space="preserve">doi: </w:t>
-      </w:r>
-      <w:hyperlink r:id="rId37">
-        <w:r>
-          <w:rPr>
-            <w:color w:val="0563C1"/>
-            <w:u w:val="single"/>
-            <w:sz w:val="22"/>
-            <w:rFonts w:ascii="Times New Roman" w:hAnsi="Times New Roman"/>
-          </w:rPr>
-          <w:t xml:space="preserve">10.18653/v1/2025.emnlp-industry.24</w:t>
-        </w:r>
-      </w:hyperlink>
-      <w:r>
-        <w:rPr>
-          <w:rFonts w:ascii="Times New Roman" w:hAnsi="Times New Roman"/>
-          <w:sz w:val="22"/>
-        </w:rPr>
-        <w:t>.</w:t>
+        <w:t>J. T. Rayfield, S. Lin, N. Zhou, and D. C. Patel, “ReAct meets industrial IoT: Language agents for data access,” in Proc. 2025 Conf. Empirical Methods in Natural Language Processing: Industry Track, Suzhou, China, Nov. 2025, pp. 364–382, doi: 10.18653/v1/2025.emnlp-industry.24.</w:t>
       </w:r>
     </w:p>
     <w:p>
@@ -9056,38 +8774,11 @@
         <w:ind w:left="720" w:hanging="720"/>
       </w:pPr>
       <w:r>
-        <w:rPr>
-          <w:rFonts w:ascii="Times New Roman" w:hAnsi="Times New Roman"/>
-          <w:sz w:val="22"/>
-        </w:rPr>
         <w:t>[14]</w:t>
+      </w:r>
+      <w:r>
         <w:tab/>
-        <w:t xml:space="preserve">N. Zhou, D. Patel, and A. Bhattacharyya, “Deployed AI agents for industrial asset management: CodeReAct framework for event analysis and work order automation,” in Proc. AAAI Conf. Artificial Intelligence, 2026, </w:t>
-      </w:r>
-      <w:r>
-        <w:rPr>
-          <w:rFonts w:ascii="Times New Roman" w:hAnsi="Times New Roman"/>
-          <w:sz w:val="22"/>
-        </w:rPr>
-        <w:t xml:space="preserve">doi: </w:t>
-      </w:r>
-      <w:hyperlink r:id="rId38">
-        <w:r>
-          <w:rPr>
-            <w:color w:val="0563C1"/>
-            <w:u w:val="single"/>
-            <w:sz w:val="22"/>
-            <w:rFonts w:ascii="Times New Roman" w:hAnsi="Times New Roman"/>
-          </w:rPr>
-          <w:t xml:space="preserve">10.1609/aaai.v40i47.41453</w:t>
-        </w:r>
-      </w:hyperlink>
-      <w:r>
-        <w:rPr>
-          <w:rFonts w:ascii="Times New Roman" w:hAnsi="Times New Roman"/>
-          <w:sz w:val="22"/>
-        </w:rPr>
-        <w:t>.</w:t>
+        <w:t>N. Zhou, D. Patel, and A. Bhattacharyya, “Deployed AI agents for industrial asset management: CodeReAct framework for event analysis and work order automation,” in Proc. AAAI Conf. Artificial Intelligence, 2026, doi: 10.1609/aaai.v40i47.41453.</w:t>
       </w:r>
     </w:p>
     <w:p>
@@ -9095,38 +8786,15 @@
         <w:ind w:left="720" w:hanging="720"/>
       </w:pPr>
       <w:r>
-        <w:rPr>
-          <w:rFonts w:ascii="Times New Roman" w:hAnsi="Times New Roman"/>
-          <w:sz w:val="22"/>
-        </w:rPr>
         <w:t>[15]</w:t>
+      </w:r>
+      <w:r>
         <w:tab/>
-        <w:t xml:space="preserve">L. Huang, W. Yu, W. Ma, W. Zhong, Z. Feng, H. Wang, Q. Chen, W. Peng, X. Feng, B. Qin, et al., “A survey on hallucination in large language models: Principles, taxonomy, challenges, and open questions,” ACM Transactions on Information Systems, vol. 43, no. 2, pp. 1–55, 2025, </w:t>
-      </w:r>
-      <w:r>
-        <w:rPr>
-          <w:rFonts w:ascii="Times New Roman" w:hAnsi="Times New Roman"/>
-          <w:sz w:val="22"/>
-        </w:rPr>
-        <w:t xml:space="preserve">doi: </w:t>
-      </w:r>
-      <w:hyperlink r:id="rId39">
-        <w:r>
-          <w:rPr>
-            <w:color w:val="0563C1"/>
-            <w:u w:val="single"/>
-            <w:sz w:val="22"/>
-            <w:rFonts w:ascii="Times New Roman" w:hAnsi="Times New Roman"/>
-          </w:rPr>
-          <w:t xml:space="preserve">10.1145/3703155</w:t>
-        </w:r>
-      </w:hyperlink>
-      <w:r>
-        <w:rPr>
-          <w:rFonts w:ascii="Times New Roman" w:hAnsi="Times New Roman"/>
-          <w:sz w:val="22"/>
-        </w:rPr>
-        <w:t>.</w:t>
+        <w:t xml:space="preserve">L. Huang, W. Yu, W. Ma, W. Zhong, Z. Feng, H. Wang, Q. Chen, W. Peng, X. Feng, B. Qin, et al., “A survey on hallucination in large language models: Principles, taxonomy, </w:t>
+      </w:r>
+      <w:r>
+        <w:lastRenderedPageBreak/>
+        <w:t>challenges, and open questions,” ACM Transactions on Information Systems, vol. 43, no. 2, pp. 1–55, 2025, doi: 10.1145/3703155.</w:t>
       </w:r>
     </w:p>
     <w:p>
@@ -9134,38 +8802,11 @@
         <w:ind w:left="720" w:hanging="720"/>
       </w:pPr>
       <w:r>
-        <w:rPr>
-          <w:rFonts w:ascii="Times New Roman" w:hAnsi="Times New Roman"/>
-          <w:sz w:val="22"/>
-        </w:rPr>
         <w:t>[16]</w:t>
+      </w:r>
+      <w:r>
         <w:tab/>
-        <w:t xml:space="preserve">A. K. M. Nor, S. R. Pedapati, M. Muhammad, and V. Leiva, “Overview of explainable artificial intelligence for prognostic and health management of industrial assets based on preferred reporting items for systematic reviews and meta-analyses,” Sensors, vol. 21, no. 23, art. no. 8020, Nov. 2021, </w:t>
-      </w:r>
-      <w:r>
-        <w:rPr>
-          <w:rFonts w:ascii="Times New Roman" w:hAnsi="Times New Roman"/>
-          <w:sz w:val="22"/>
-        </w:rPr>
-        <w:t xml:space="preserve">doi: </w:t>
-      </w:r>
-      <w:hyperlink r:id="rId40">
-        <w:r>
-          <w:rPr>
-            <w:color w:val="0563C1"/>
-            <w:u w:val="single"/>
-            <w:sz w:val="22"/>
-            <w:rFonts w:ascii="Times New Roman" w:hAnsi="Times New Roman"/>
-          </w:rPr>
-          <w:t xml:space="preserve">10.3390/s21238020</w:t>
-        </w:r>
-      </w:hyperlink>
-      <w:r>
-        <w:rPr>
-          <w:rFonts w:ascii="Times New Roman" w:hAnsi="Times New Roman"/>
-          <w:sz w:val="22"/>
-        </w:rPr>
-        <w:t>.</w:t>
+        <w:t>A. K. M. Nor, S. R. Pedapati, M. Muhammad, and V. Leiva, “Overview of explainable artificial intelligence for prognostic and health management of industrial assets based on preferred reporting items for systematic reviews and meta-analyses,” Sensors, vol. 21, no. 23, art. no. 8020, Nov. 2021, doi: 10.3390/s21238020.</w:t>
       </w:r>
     </w:p>
     <w:p>
@@ -9173,38 +8814,11 @@
         <w:ind w:left="720" w:hanging="720"/>
       </w:pPr>
       <w:r>
-        <w:rPr>
-          <w:rFonts w:ascii="Times New Roman" w:hAnsi="Times New Roman"/>
-          <w:sz w:val="22"/>
-        </w:rPr>
         <w:t>[17]</w:t>
+      </w:r>
+      <w:r>
         <w:tab/>
-        <w:t xml:space="preserve">S. Matzka, “Explainable artificial intelligence for predictive maintenance applications,” in Proc. 3rd Int. Conf. Artificial Intelligence for Industries (AI4I), Irvine, CA, USA, Sep. 2020, pp. 69–74, </w:t>
-      </w:r>
-      <w:r>
-        <w:rPr>
-          <w:rFonts w:ascii="Times New Roman" w:hAnsi="Times New Roman"/>
-          <w:sz w:val="22"/>
-        </w:rPr>
-        <w:t xml:space="preserve">doi: </w:t>
-      </w:r>
-      <w:hyperlink r:id="rId41">
-        <w:r>
-          <w:rPr>
-            <w:color w:val="0563C1"/>
-            <w:u w:val="single"/>
-            <w:sz w:val="22"/>
-            <w:rFonts w:ascii="Times New Roman" w:hAnsi="Times New Roman"/>
-          </w:rPr>
-          <w:t xml:space="preserve">10.1109/AI4I49448.2020.00023</w:t>
-        </w:r>
-      </w:hyperlink>
-      <w:r>
-        <w:rPr>
-          <w:rFonts w:ascii="Times New Roman" w:hAnsi="Times New Roman"/>
-          <w:sz w:val="22"/>
-        </w:rPr>
-        <w:t>.</w:t>
+        <w:t>S. Matzka, “Explainable artificial intelligence for predictive maintenance applications,” in Proc. 3rd Int. Conf. Artificial Intelligence for Industries (AI4I), Irvine, CA, USA, Sep. 2020, pp. 69–74, doi: 10.1109/AI4I49448.2020.00023.</w:t>
       </w:r>
     </w:p>
     <w:p>
@@ -9212,38 +8826,11 @@
         <w:ind w:left="720" w:hanging="720"/>
       </w:pPr>
       <w:r>
-        <w:rPr>
-          <w:rFonts w:ascii="Times New Roman" w:hAnsi="Times New Roman"/>
-          <w:sz w:val="22"/>
-        </w:rPr>
         <w:t>[18]</w:t>
+      </w:r>
+      <w:r>
         <w:tab/>
-        <w:t xml:space="preserve">K. T. P. Nguyen, K. Medjaher, and T.-D. Tran, “A review of artificial intelligence methods for engineering prognostics and health management with implementation guidelines,” Artificial Intelligence Review, vol. 56, no. 4, pp. 3659–3709, 2023, </w:t>
-      </w:r>
-      <w:r>
-        <w:rPr>
-          <w:rFonts w:ascii="Times New Roman" w:hAnsi="Times New Roman"/>
-          <w:sz w:val="22"/>
-        </w:rPr>
-        <w:t xml:space="preserve">doi: </w:t>
-      </w:r>
-      <w:hyperlink r:id="rId42">
-        <w:r>
-          <w:rPr>
-            <w:color w:val="0563C1"/>
-            <w:u w:val="single"/>
-            <w:sz w:val="22"/>
-            <w:rFonts w:ascii="Times New Roman" w:hAnsi="Times New Roman"/>
-          </w:rPr>
-          <w:t xml:space="preserve">10.1007/s10462-022-10260-y</w:t>
-        </w:r>
-      </w:hyperlink>
-      <w:r>
-        <w:rPr>
-          <w:rFonts w:ascii="Times New Roman" w:hAnsi="Times New Roman"/>
-          <w:sz w:val="22"/>
-        </w:rPr>
-        <w:t>.</w:t>
+        <w:t>K. T. P. Nguyen, K. Medjaher, and T.-D. Tran, “A review of artificial intelligence methods for engineering prognostics and health management with implementation guidelines,” Artificial Intelligence Review, vol. 56, no. 4, pp. 3659–3709, 2023, doi: 10.1007/s10462-022-10260-y.</w:t>
       </w:r>
     </w:p>
     <w:p>
@@ -9251,38 +8838,11 @@
         <w:ind w:left="720" w:hanging="720"/>
       </w:pPr>
       <w:r>
-        <w:rPr>
-          <w:rFonts w:ascii="Times New Roman" w:hAnsi="Times New Roman"/>
-          <w:sz w:val="22"/>
-        </w:rPr>
         <w:t>[19]</w:t>
+      </w:r>
+      <w:r>
         <w:tab/>
-        <w:t xml:space="preserve">R. van Dinter, B. Tekinerdogan, and C. Catal, “Predictive maintenance using digital twins: A systematic literature review,” Information and Software Technology, vol. 151, art. no. 107008, Nov. 2022, </w:t>
-      </w:r>
-      <w:r>
-        <w:rPr>
-          <w:rFonts w:ascii="Times New Roman" w:hAnsi="Times New Roman"/>
-          <w:sz w:val="22"/>
-        </w:rPr>
-        <w:t xml:space="preserve">doi: </w:t>
-      </w:r>
-      <w:hyperlink r:id="rId43">
-        <w:r>
-          <w:rPr>
-            <w:color w:val="0563C1"/>
-            <w:u w:val="single"/>
-            <w:sz w:val="22"/>
-            <w:rFonts w:ascii="Times New Roman" w:hAnsi="Times New Roman"/>
-          </w:rPr>
-          <w:t xml:space="preserve">10.1016/j.infsof.2022.107008</w:t>
-        </w:r>
-      </w:hyperlink>
-      <w:r>
-        <w:rPr>
-          <w:rFonts w:ascii="Times New Roman" w:hAnsi="Times New Roman"/>
-          <w:sz w:val="22"/>
-        </w:rPr>
-        <w:t>.</w:t>
+        <w:t>R. van Dinter, B. Tekinerdogan, and C. Catal, “Predictive maintenance using digital twins: A systematic literature review,” Information and Software Technology, vol. 151, art. no. 107008, Nov. 2022, doi: 10.1016/j.infsof.2022.107008.</w:t>
       </w:r>
     </w:p>
     <w:p>
@@ -9290,38 +8850,11 @@
         <w:ind w:left="720" w:hanging="720"/>
       </w:pPr>
       <w:r>
-        <w:rPr>
-          <w:rFonts w:ascii="Times New Roman" w:hAnsi="Times New Roman"/>
-          <w:sz w:val="22"/>
-        </w:rPr>
         <w:t>[20]</w:t>
+      </w:r>
+      <w:r>
         <w:tab/>
-        <w:t xml:space="preserve">W. Shi, J. Cao, Q. Zhang, Y. Li, and L. Xu, “Edge computing: Vision and challenges,” IEEE Internet of Things Journal, vol. 3, no. 5, pp. 637–646, Oct. 2016, </w:t>
-      </w:r>
-      <w:r>
-        <w:rPr>
-          <w:rFonts w:ascii="Times New Roman" w:hAnsi="Times New Roman"/>
-          <w:sz w:val="22"/>
-        </w:rPr>
-        <w:t xml:space="preserve">doi: </w:t>
-      </w:r>
-      <w:hyperlink r:id="rId44">
-        <w:r>
-          <w:rPr>
-            <w:color w:val="0563C1"/>
-            <w:u w:val="single"/>
-            <w:sz w:val="22"/>
-            <w:rFonts w:ascii="Times New Roman" w:hAnsi="Times New Roman"/>
-          </w:rPr>
-          <w:t xml:space="preserve">10.1109/JIOT.2016.2579198</w:t>
-        </w:r>
-      </w:hyperlink>
-      <w:r>
-        <w:rPr>
-          <w:rFonts w:ascii="Times New Roman" w:hAnsi="Times New Roman"/>
-          <w:sz w:val="22"/>
-        </w:rPr>
-        <w:t>.</w:t>
+        <w:t>W. Shi, J. Cao, Q. Zhang, Y. Li, and L. Xu, “Edge computing: Vision and challenges,” IEEE Internet of Things Journal, vol. 3, no. 5, pp. 637–646, Oct. 2016, doi: 10.1109/JIOT.2016.2579198.</w:t>
       </w:r>
     </w:p>
     <w:p>
@@ -9329,38 +8862,11 @@
         <w:ind w:left="720" w:hanging="720"/>
       </w:pPr>
       <w:r>
-        <w:rPr>
-          <w:rFonts w:ascii="Times New Roman" w:hAnsi="Times New Roman"/>
-          <w:sz w:val="22"/>
-        </w:rPr>
         <w:t>[21]</w:t>
+      </w:r>
+      <w:r>
         <w:tab/>
-        <w:t xml:space="preserve">M. Satyanarayanan, “The emergence of edge computing,” Computer, vol. 50, no. 1, pp. 30–39, Jan. 2017, </w:t>
-      </w:r>
-      <w:r>
-        <w:rPr>
-          <w:rFonts w:ascii="Times New Roman" w:hAnsi="Times New Roman"/>
-          <w:sz w:val="22"/>
-        </w:rPr>
-        <w:t xml:space="preserve">doi: </w:t>
-      </w:r>
-      <w:hyperlink r:id="rId45">
-        <w:r>
-          <w:rPr>
-            <w:color w:val="0563C1"/>
-            <w:u w:val="single"/>
-            <w:sz w:val="22"/>
-            <w:rFonts w:ascii="Times New Roman" w:hAnsi="Times New Roman"/>
-          </w:rPr>
-          <w:t xml:space="preserve">10.1109/MC.2017.9</w:t>
-        </w:r>
-      </w:hyperlink>
-      <w:r>
-        <w:rPr>
-          <w:rFonts w:ascii="Times New Roman" w:hAnsi="Times New Roman"/>
-          <w:sz w:val="22"/>
-        </w:rPr>
-        <w:t>.</w:t>
+        <w:t>M. Satyanarayanan, “The emergence of edge computing,” Computer, vol. 50, no. 1, pp. 30–39, Jan. 2017, doi: 10.1109/MC.2017.9.</w:t>
       </w:r>
     </w:p>
     <w:p>
@@ -9368,38 +8874,11 @@
         <w:ind w:left="720" w:hanging="720"/>
       </w:pPr>
       <w:r>
-        <w:rPr>
-          <w:rFonts w:ascii="Times New Roman" w:hAnsi="Times New Roman"/>
-          <w:sz w:val="22"/>
-        </w:rPr>
         <w:t>[22]</w:t>
+      </w:r>
+      <w:r>
         <w:tab/>
-        <w:t xml:space="preserve">N. Naik, “Choice of effective messaging protocols for IoT systems: MQTT, CoAP, AMQP and HTTP,” in Proc. IEEE Int. Systems Engineering Symposium (ISSE), Vienna, Austria, Oct. 2017, pp. 1–7, </w:t>
-      </w:r>
-      <w:r>
-        <w:rPr>
-          <w:rFonts w:ascii="Times New Roman" w:hAnsi="Times New Roman"/>
-          <w:sz w:val="22"/>
-        </w:rPr>
-        <w:t xml:space="preserve">doi: </w:t>
-      </w:r>
-      <w:hyperlink r:id="rId46">
-        <w:r>
-          <w:rPr>
-            <w:color w:val="0563C1"/>
-            <w:u w:val="single"/>
-            <w:sz w:val="22"/>
-            <w:rFonts w:ascii="Times New Roman" w:hAnsi="Times New Roman"/>
-          </w:rPr>
-          <w:t xml:space="preserve">10.1109/SysEng.2017.8088251</w:t>
-        </w:r>
-      </w:hyperlink>
-      <w:r>
-        <w:rPr>
-          <w:rFonts w:ascii="Times New Roman" w:hAnsi="Times New Roman"/>
-          <w:sz w:val="22"/>
-        </w:rPr>
-        <w:t>.</w:t>
+        <w:t>N. Naik, “Choice of effective messaging protocols for IoT systems: MQTT, CoAP, AMQP and HTTP,” in Proc. IEEE Int. Systems Engineering Symposium (ISSE), Vienna, Austria, Oct. 2017, pp. 1–7, doi: 10.1109/SysEng.2017.8088251.</w:t>
       </w:r>
     </w:p>
     <w:p>
@@ -9407,38 +8886,11 @@
         <w:ind w:left="720" w:hanging="720"/>
       </w:pPr>
       <w:r>
-        <w:rPr>
-          <w:rFonts w:ascii="Times New Roman" w:hAnsi="Times New Roman"/>
-          <w:sz w:val="22"/>
-        </w:rPr>
         <w:t>[23]</w:t>
+      </w:r>
+      <w:r>
         <w:tab/>
-        <w:t xml:space="preserve">A. Al-Fuqaha, M. Guizani, M. Mohammadi, M. Aledhari, and M. Ayyash, “Internet of Things: A survey on enabling technologies, protocols, and applications,” IEEE Communications Surveys &amp; Tutorials, vol. 17, no. 4, pp. 2347–2376, 4th Quart. 2015, </w:t>
-      </w:r>
-      <w:r>
-        <w:rPr>
-          <w:rFonts w:ascii="Times New Roman" w:hAnsi="Times New Roman"/>
-          <w:sz w:val="22"/>
-        </w:rPr>
-        <w:t xml:space="preserve">doi: </w:t>
-      </w:r>
-      <w:hyperlink r:id="rId47">
-        <w:r>
-          <w:rPr>
-            <w:color w:val="0563C1"/>
-            <w:u w:val="single"/>
-            <w:sz w:val="22"/>
-            <w:rFonts w:ascii="Times New Roman" w:hAnsi="Times New Roman"/>
-          </w:rPr>
-          <w:t xml:space="preserve">10.1109/COMST.2015.2444095</w:t>
-        </w:r>
-      </w:hyperlink>
-      <w:r>
-        <w:rPr>
-          <w:rFonts w:ascii="Times New Roman" w:hAnsi="Times New Roman"/>
-          <w:sz w:val="22"/>
-        </w:rPr>
-        <w:t>.</w:t>
+        <w:t>A. Al-Fuqaha, M. Guizani, M. Mohammadi, M. Aledhari, and M. Ayyash, “Internet of Things: A survey on enabling technologies, protocols, and applications,” IEEE Communications Surveys &amp; Tutorials, vol. 17, no. 4, pp. 2347–2376, 4th Quart. 2015, doi: 10.1109/COMST.2015.2444095.</w:t>
       </w:r>
     </w:p>
     <w:p>
@@ -9446,38 +8898,11 @@
         <w:ind w:left="720" w:hanging="720"/>
       </w:pPr>
       <w:r>
-        <w:rPr>
-          <w:rFonts w:ascii="Times New Roman" w:hAnsi="Times New Roman"/>
-          <w:sz w:val="22"/>
-        </w:rPr>
         <w:t>[24]</w:t>
+      </w:r>
+      <w:r>
         <w:tab/>
-        <w:t xml:space="preserve">J. Wei, X. Wang, D. Schuurmans, M. Bosma, B. Ichter, F. Xia, E. Chi, Q. Le, and D. Zhou, “Chain-of-thought prompting elicits reasoning in large language models,” in Proc. 36th Conf. Neural Information Processing Systems (NeurIPS), New Orleans, LA, USA, Dec. 2022, </w:t>
-      </w:r>
-      <w:r>
-        <w:rPr>
-          <w:rFonts w:ascii="Times New Roman" w:hAnsi="Times New Roman"/>
-          <w:sz w:val="22"/>
-        </w:rPr>
-        <w:t xml:space="preserve">[Online]. Available: </w:t>
-      </w:r>
-      <w:hyperlink r:id="rId48">
-        <w:r>
-          <w:rPr>
-            <w:color w:val="0563C1"/>
-            <w:u w:val="single"/>
-            <w:sz w:val="22"/>
-            <w:rFonts w:ascii="Times New Roman" w:hAnsi="Times New Roman"/>
-          </w:rPr>
-          <w:t xml:space="preserve">https://arxiv.org/abs/2201.11903</w:t>
-        </w:r>
-      </w:hyperlink>
-      <w:r>
-        <w:rPr>
-          <w:rFonts w:ascii="Times New Roman" w:hAnsi="Times New Roman"/>
-          <w:sz w:val="22"/>
-        </w:rPr>
-        <w:t>.</w:t>
+        <w:t>J. Wei, X. Wang, D. Schuurmans, M. Bosma, B. Ichter, F. Xia, E. Chi, Q. Le, and D. Zhou, “Chain-of-thought prompting elicits reasoning in large language models,” in Proc. 36th Conf. Neural Information Processing Systems (NeurIPS), New Orleans, LA, USA, Dec. 2022.</w:t>
       </w:r>
     </w:p>
     <w:p>
@@ -9485,38 +8910,11 @@
         <w:ind w:left="720" w:hanging="720"/>
       </w:pPr>
       <w:r>
-        <w:rPr>
-          <w:rFonts w:ascii="Times New Roman" w:hAnsi="Times New Roman"/>
-          <w:sz w:val="22"/>
-        </w:rPr>
         <w:t>[25]</w:t>
+      </w:r>
+      <w:r>
         <w:tab/>
-        <w:t xml:space="preserve">P. Lewis et al., “Retrieval-augmented generation for knowledge-intensive NLP tasks,” in Proc. NeurIPS, 2020, </w:t>
-      </w:r>
-      <w:r>
-        <w:rPr>
-          <w:rFonts w:ascii="Times New Roman" w:hAnsi="Times New Roman"/>
-          <w:sz w:val="22"/>
-        </w:rPr>
-        <w:t xml:space="preserve">doi: </w:t>
-      </w:r>
-      <w:hyperlink r:id="rId49">
-        <w:r>
-          <w:rPr>
-            <w:color w:val="0563C1"/>
-            <w:u w:val="single"/>
-            <w:sz w:val="22"/>
-            <w:rFonts w:ascii="Times New Roman" w:hAnsi="Times New Roman"/>
-          </w:rPr>
-          <w:t xml:space="preserve">10.48550/arXiv.2005.11401</w:t>
-        </w:r>
-      </w:hyperlink>
-      <w:r>
-        <w:rPr>
-          <w:rFonts w:ascii="Times New Roman" w:hAnsi="Times New Roman"/>
-          <w:sz w:val="22"/>
-        </w:rPr>
-        <w:t>.</w:t>
+        <w:t>P. Lewis et al., “Retrieval-augmented generation for knowledge-intensive NLP tasks,” in Proc. NeurIPS, 2020. [Online]. Available: https://proceedings.neurips.cc/paper/2020/hash/6b493230205f780e1bc26945df7481e5-Abstract.html and arXiv:2005.11401, doi: 10.48550/arXiv.2005.11401.</w:t>
       </w:r>
     </w:p>
     <w:p>
@@ -9524,38 +8922,15 @@
         <w:ind w:left="720" w:hanging="720"/>
       </w:pPr>
       <w:r>
-        <w:rPr>
-          <w:rFonts w:ascii="Times New Roman" w:hAnsi="Times New Roman"/>
-          <w:sz w:val="22"/>
-        </w:rPr>
         <w:t>[26]</w:t>
+      </w:r>
+      <w:r>
         <w:tab/>
-        <w:t xml:space="preserve">S. M. Lundberg and S.-I. Lee, “A unified approach to interpreting model predictions,” in Proc. NeurIPS, 2017, pp. 4765–4774, </w:t>
-      </w:r>
-      <w:r>
-        <w:rPr>
-          <w:rFonts w:ascii="Times New Roman" w:hAnsi="Times New Roman"/>
-          <w:sz w:val="22"/>
-        </w:rPr>
-        <w:t xml:space="preserve">doi: </w:t>
-      </w:r>
-      <w:hyperlink r:id="rId50">
-        <w:r>
-          <w:rPr>
-            <w:color w:val="0563C1"/>
-            <w:u w:val="single"/>
-            <w:sz w:val="22"/>
-            <w:rFonts w:ascii="Times New Roman" w:hAnsi="Times New Roman"/>
-          </w:rPr>
-          <w:t xml:space="preserve">10.48550/arXiv.1705.07874</w:t>
-        </w:r>
-      </w:hyperlink>
-      <w:r>
-        <w:rPr>
-          <w:rFonts w:ascii="Times New Roman" w:hAnsi="Times New Roman"/>
-          <w:sz w:val="22"/>
-        </w:rPr>
-        <w:t>.</w:t>
+        <w:t xml:space="preserve">S. M. Lundberg and S.-I. Lee, “A unified approach to interpreting model predictions,” in Proc. NeurIPS, 2017, pp. 4765–4774. [Online]. Available: </w:t>
+      </w:r>
+      <w:r>
+        <w:lastRenderedPageBreak/>
+        <w:t>https://proceedings.neurips.cc/paper/2017/hash/8a20a8621978632d76c43dfd28b67767-Abstract.html and arXiv:1705.07874, doi: 10.48550/arXiv.1705.07874.</w:t>
       </w:r>
     </w:p>
     <w:p>
@@ -9563,38 +8938,11 @@
         <w:ind w:left="720" w:hanging="720"/>
       </w:pPr>
       <w:r>
-        <w:rPr>
-          <w:rFonts w:ascii="Times New Roman" w:hAnsi="Times New Roman"/>
-          <w:sz w:val="22"/>
-        </w:rPr>
         <w:t>[27]</w:t>
+      </w:r>
+      <w:r>
         <w:tab/>
-        <w:t xml:space="preserve">S. Amershi, D. Weld, M. Vorvoreanu, A. Fourney, B. Nushi, P. Collisson, J. Suh, S. Iqbal, P. N. Bennett, K. Inkpen, J. Teevan, R. Kikin-Gil, and E. Horvitz, “Guidelines for human-AI interaction,” in Proc. CHI Conf. Human Factors in Computing Systems, Glasgow, U.K., May 2019, pp. 1–13, </w:t>
-      </w:r>
-      <w:r>
-        <w:rPr>
-          <w:rFonts w:ascii="Times New Roman" w:hAnsi="Times New Roman"/>
-          <w:sz w:val="22"/>
-        </w:rPr>
-        <w:t xml:space="preserve">doi: </w:t>
-      </w:r>
-      <w:hyperlink r:id="rId51">
-        <w:r>
-          <w:rPr>
-            <w:color w:val="0563C1"/>
-            <w:u w:val="single"/>
-            <w:sz w:val="22"/>
-            <w:rFonts w:ascii="Times New Roman" w:hAnsi="Times New Roman"/>
-          </w:rPr>
-          <w:t xml:space="preserve">10.1145/3290605.3300233</w:t>
-        </w:r>
-      </w:hyperlink>
-      <w:r>
-        <w:rPr>
-          <w:rFonts w:ascii="Times New Roman" w:hAnsi="Times New Roman"/>
-          <w:sz w:val="22"/>
-        </w:rPr>
-        <w:t>.</w:t>
+        <w:t>S. Amershi, D. Weld, M. Vorvoreanu, A. Fourney, B. Nushi, P. Collisson, J. Suh, S. Iqbal, P. N. Bennett, K. Inkpen, J. Teevan, R. Kikin-Gil, and E. Horvitz, “Guidelines for human-AI interaction,” in Proc. CHI Conf. Human Factors in Computing Systems, Glasgow, U.K., May 2019, pp. 1–13, doi: 10.1145/3290605.3300233.</w:t>
       </w:r>
     </w:p>
     <w:p>
@@ -9602,38 +8950,11 @@
         <w:ind w:left="720" w:hanging="720"/>
       </w:pPr>
       <w:r>
-        <w:rPr>
-          <w:rFonts w:ascii="Times New Roman" w:hAnsi="Times New Roman"/>
-          <w:sz w:val="22"/>
-        </w:rPr>
         <w:t>[28]</w:t>
+      </w:r>
+      <w:r>
         <w:tab/>
-        <w:t xml:space="preserve">R. B. Randall, Vibration-Based Condition Monitoring: Industrial, Aerospace and Automotive Applications, 2nd ed. Chichester, U.K.: John Wiley &amp; Sons, 2021, </w:t>
-      </w:r>
-      <w:r>
-        <w:rPr>
-          <w:rFonts w:ascii="Times New Roman" w:hAnsi="Times New Roman"/>
-          <w:sz w:val="22"/>
-        </w:rPr>
-        <w:t xml:space="preserve">doi: </w:t>
-      </w:r>
-      <w:hyperlink r:id="rId52">
-        <w:r>
-          <w:rPr>
-            <w:color w:val="0563C1"/>
-            <w:u w:val="single"/>
-            <w:sz w:val="22"/>
-            <w:rFonts w:ascii="Times New Roman" w:hAnsi="Times New Roman"/>
-          </w:rPr>
-          <w:t xml:space="preserve">10.1002/9781119479819</w:t>
-        </w:r>
-      </w:hyperlink>
-      <w:r>
-        <w:rPr>
-          <w:rFonts w:ascii="Times New Roman" w:hAnsi="Times New Roman"/>
-          <w:sz w:val="22"/>
-        </w:rPr>
-        <w:t>.</w:t>
+        <w:t>R. B. Randall, Vibration-Based Condition Monitoring: Industrial, Aerospace and Automotive Applications, 2nd ed. Chichester, U.K.: John Wiley &amp; Sons, 2021.</w:t>
       </w:r>
     </w:p>
     <w:p>
@@ -9641,38 +8962,11 @@
         <w:ind w:left="720" w:hanging="720"/>
       </w:pPr>
       <w:r>
-        <w:rPr>
-          <w:rFonts w:ascii="Times New Roman" w:hAnsi="Times New Roman"/>
-          <w:sz w:val="22"/>
-        </w:rPr>
         <w:t>[29]</w:t>
+      </w:r>
+      <w:r>
         <w:tab/>
-        <w:t xml:space="preserve">Mechanical Vibration — Evaluation of Machine Vibration by Measurements on Non-Rotating Parts — Part 3: Industrial Machines with Nominal Power Above 15 kW and Nominal Speeds Between 120 r/min and 15 000 r/min When Measured In Situ, ISO 10816-3:2009, International Organization for Standardization, Geneva, Switzerland, 2009, </w:t>
-      </w:r>
-      <w:r>
-        <w:rPr>
-          <w:rFonts w:ascii="Times New Roman" w:hAnsi="Times New Roman"/>
-          <w:sz w:val="22"/>
-        </w:rPr>
-        <w:t xml:space="preserve">[Online]. Available: </w:t>
-      </w:r>
-      <w:hyperlink r:id="rId53">
-        <w:r>
-          <w:rPr>
-            <w:color w:val="0563C1"/>
-            <w:u w:val="single"/>
-            <w:sz w:val="22"/>
-            <w:rFonts w:ascii="Times New Roman" w:hAnsi="Times New Roman"/>
-          </w:rPr>
-          <w:t xml:space="preserve">https://www.iso.org/standard/50527.html</w:t>
-        </w:r>
-      </w:hyperlink>
-      <w:r>
-        <w:rPr>
-          <w:rFonts w:ascii="Times New Roman" w:hAnsi="Times New Roman"/>
-          <w:sz w:val="22"/>
-        </w:rPr>
-        <w:t>.</w:t>
+        <w:t>Mechanical Vibration — Evaluation of Machine Vibration by Measurements on Non-Rotating Parts — Part 3: Industrial Machines with Nominal Power Above 15 kW and Nominal Speeds Between 120 r/min and 15 000 r/min When Measured In Situ, ISO 10816-3:2009, International Organization for Standardization, Geneva, Switzerland, 2009.</w:t>
       </w:r>
     </w:p>
     <w:p>
@@ -9680,38 +8974,11 @@
         <w:ind w:left="720" w:hanging="720"/>
       </w:pPr>
       <w:r>
-        <w:rPr>
-          <w:rFonts w:ascii="Times New Roman" w:hAnsi="Times New Roman"/>
-          <w:sz w:val="22"/>
-        </w:rPr>
         <w:t>[30]</w:t>
+      </w:r>
+      <w:r>
         <w:tab/>
-        <w:t xml:space="preserve">P. Warden and D. Situnayake, TinyML: Machine Learning with TensorFlow Lite on Arduino and Ultra-Low-Power Microcontrollers. Sebastopol, CA, USA: O’Reilly Media, 2020, </w:t>
-      </w:r>
-      <w:r>
-        <w:rPr>
-          <w:rFonts w:ascii="Times New Roman" w:hAnsi="Times New Roman"/>
-          <w:sz w:val="22"/>
-        </w:rPr>
-        <w:t xml:space="preserve">[Online]. Available: </w:t>
-      </w:r>
-      <w:hyperlink r:id="rId54">
-        <w:r>
-          <w:rPr>
-            <w:color w:val="0563C1"/>
-            <w:u w:val="single"/>
-            <w:sz w:val="22"/>
-            <w:rFonts w:ascii="Times New Roman" w:hAnsi="Times New Roman"/>
-          </w:rPr>
-          <w:t xml:space="preserve">https://www.oreilly.com/library/view/tinyml/9781492052036/</w:t>
-        </w:r>
-      </w:hyperlink>
-      <w:r>
-        <w:rPr>
-          <w:rFonts w:ascii="Times New Roman" w:hAnsi="Times New Roman"/>
-          <w:sz w:val="22"/>
-        </w:rPr>
-        <w:t>.</w:t>
+        <w:t>P. Warden and D. Situnayake, TinyML: Machine Learning with TensorFlow Lite on Arduino and Ultra-Low-Power Microcontrollers. Sebastopol, CA, USA: O’Reilly Media, 2020. [Online]. Available: https://www.oreilly.com/library/view/tinyml/9781492052036/</w:t>
       </w:r>
     </w:p>
     <w:p>
@@ -9719,38 +8986,11 @@
         <w:ind w:left="720" w:hanging="720"/>
       </w:pPr>
       <w:r>
-        <w:rPr>
-          <w:rFonts w:ascii="Times New Roman" w:hAnsi="Times New Roman"/>
-          <w:sz w:val="22"/>
-        </w:rPr>
         <w:t>[31]</w:t>
+      </w:r>
+      <w:r>
         <w:tab/>
-        <w:t xml:space="preserve">Z. Xi et al., “The rise and potential of large language model based agents: A survey,” Science China Information Sciences, vol. 68, art. no. 121101, 2025, (also arXiv:2309.07864, </w:t>
-      </w:r>
-      <w:r>
-        <w:rPr>
-          <w:rFonts w:ascii="Times New Roman" w:hAnsi="Times New Roman"/>
-          <w:sz w:val="22"/>
-        </w:rPr>
-        <w:t xml:space="preserve">doi: </w:t>
-      </w:r>
-      <w:hyperlink r:id="rId55">
-        <w:r>
-          <w:rPr>
-            <w:color w:val="0563C1"/>
-            <w:u w:val="single"/>
-            <w:sz w:val="22"/>
-            <w:rFonts w:ascii="Times New Roman" w:hAnsi="Times New Roman"/>
-          </w:rPr>
-          <w:t xml:space="preserve">10.1007/s11432-024-4222-0</w:t>
-        </w:r>
-      </w:hyperlink>
-      <w:r>
-        <w:rPr>
-          <w:rFonts w:ascii="Times New Roman" w:hAnsi="Times New Roman"/>
-          <w:sz w:val="22"/>
-        </w:rPr>
-        <w:t>.</w:t>
+        <w:t>Z. Xi et al., “The rise and potential of large language model based agents: A survey,” Science China Information Sciences, vol. 68, art. no. 121101, 2025, doi: 10.1007/s11432-024-4222-0 (also arXiv:2309.07864, doi: 10.48550/arXiv.2309.07864).</w:t>
       </w:r>
     </w:p>
     <w:p>
@@ -9758,38 +8998,11 @@
         <w:ind w:left="720" w:hanging="720"/>
       </w:pPr>
       <w:r>
-        <w:rPr>
-          <w:rFonts w:ascii="Times New Roman" w:hAnsi="Times New Roman"/>
-          <w:sz w:val="22"/>
-        </w:rPr>
         <w:t>[32]</w:t>
+      </w:r>
+      <w:r>
         <w:tab/>
-        <w:t xml:space="preserve">L. Wang, C. Ma, X. Feng, Z. Zhang, H. Yang, J. Zhang, et al., “A survey on large language model based autonomous agents,” Frontiers of Computer Science, vol. 18, no. 6, art. no. 186345, 2024, </w:t>
-      </w:r>
-      <w:r>
-        <w:rPr>
-          <w:rFonts w:ascii="Times New Roman" w:hAnsi="Times New Roman"/>
-          <w:sz w:val="22"/>
-        </w:rPr>
-        <w:t xml:space="preserve">doi: </w:t>
-      </w:r>
-      <w:hyperlink r:id="rId56">
-        <w:r>
-          <w:rPr>
-            <w:color w:val="0563C1"/>
-            <w:u w:val="single"/>
-            <w:sz w:val="22"/>
-            <w:rFonts w:ascii="Times New Roman" w:hAnsi="Times New Roman"/>
-          </w:rPr>
-          <w:t xml:space="preserve">10.1007/s11704-024-40231-1</w:t>
-        </w:r>
-      </w:hyperlink>
-      <w:r>
-        <w:rPr>
-          <w:rFonts w:ascii="Times New Roman" w:hAnsi="Times New Roman"/>
-          <w:sz w:val="22"/>
-        </w:rPr>
-        <w:t>.</w:t>
+        <w:t>L. Wang, C. Ma, X. Feng, Z. Zhang, H. Yang, J. Zhang, et al., “A survey on large language model based autonomous agents,” Frontiers of Computer Science, vol. 18, no. 6, art. no. 186345, 2024, doi: 10.1007/s11704-024-40231-1.</w:t>
       </w:r>
     </w:p>
     <w:p>
@@ -9797,38 +9010,11 @@
         <w:ind w:left="720" w:hanging="720"/>
       </w:pPr>
       <w:r>
-        <w:rPr>
-          <w:rFonts w:ascii="Times New Roman" w:hAnsi="Times New Roman"/>
-          <w:sz w:val="22"/>
-        </w:rPr>
         <w:t>[33]</w:t>
+      </w:r>
+      <w:r>
         <w:tab/>
-        <w:t xml:space="preserve">eLabtronics, “runlinc: Rapid development platform for IoT, AI and STEM inventions.” Accessed: Aug.15,2026, </w:t>
-      </w:r>
-      <w:r>
-        <w:rPr>
-          <w:rFonts w:ascii="Times New Roman" w:hAnsi="Times New Roman"/>
-          <w:sz w:val="22"/>
-        </w:rPr>
-        <w:t xml:space="preserve">[Online]. Available: </w:t>
-      </w:r>
-      <w:hyperlink r:id="rId57">
-        <w:r>
-          <w:rPr>
-            <w:color w:val="0563C1"/>
-            <w:u w:val="single"/>
-            <w:sz w:val="22"/>
-            <w:rFonts w:ascii="Times New Roman" w:hAnsi="Times New Roman"/>
-          </w:rPr>
-          <w:t xml:space="preserve">https://runlinc.com</w:t>
-        </w:r>
-      </w:hyperlink>
-      <w:r>
-        <w:rPr>
-          <w:rFonts w:ascii="Times New Roman" w:hAnsi="Times New Roman"/>
-          <w:sz w:val="22"/>
-        </w:rPr>
-        <w:t>.</w:t>
+        <w:t>eLabtronics, “runlinc: Rapid development platform for IoT, AI and STEM inventions.” Accessed: Aug.15,2026. [Online]. Available: https://runlinc.com</w:t>
       </w:r>
     </w:p>
     <w:p>
@@ -9836,38 +9022,11 @@
         <w:ind w:left="720" w:hanging="720"/>
       </w:pPr>
       <w:r>
-        <w:rPr>
-          <w:rFonts w:ascii="Times New Roman" w:hAnsi="Times New Roman"/>
-          <w:sz w:val="22"/>
-        </w:rPr>
         <w:t>[34]</w:t>
+      </w:r>
+      <w:r>
         <w:tab/>
-        <w:t xml:space="preserve">Espressif Systems, “ESP32 series datasheet,” Espressif Systems, Shanghai, China. Accessed: Aug.15,2026, </w:t>
-      </w:r>
-      <w:r>
-        <w:rPr>
-          <w:rFonts w:ascii="Times New Roman" w:hAnsi="Times New Roman"/>
-          <w:sz w:val="22"/>
-        </w:rPr>
-        <w:t xml:space="preserve">[Online]. Available: </w:t>
-      </w:r>
-      <w:hyperlink r:id="rId58">
-        <w:r>
-          <w:rPr>
-            <w:color w:val="0563C1"/>
-            <w:u w:val="single"/>
-            <w:sz w:val="22"/>
-            <w:rFonts w:ascii="Times New Roman" w:hAnsi="Times New Roman"/>
-          </w:rPr>
-          <w:t xml:space="preserve">https://www.espressif.com/en/support/documents/technical-documents</w:t>
-        </w:r>
-      </w:hyperlink>
-      <w:r>
-        <w:rPr>
-          <w:rFonts w:ascii="Times New Roman" w:hAnsi="Times New Roman"/>
-          <w:sz w:val="22"/>
-        </w:rPr>
-        <w:t>.</w:t>
+        <w:t>Espressif Systems, “ESP32 series datasheet,” Espressif Systems, Shanghai, China. Accessed: Aug.15,2026. [Online]. Available: https://www.espressif.com/en/support/documents/technical-documents</w:t>
       </w:r>
     </w:p>
     <w:p>
@@ -9875,38 +9034,11 @@
         <w:ind w:left="720" w:hanging="720"/>
       </w:pPr>
       <w:r>
-        <w:rPr>
-          <w:rFonts w:ascii="Times New Roman" w:hAnsi="Times New Roman"/>
-          <w:sz w:val="22"/>
-        </w:rPr>
         <w:t>[35]</w:t>
+      </w:r>
+      <w:r>
         <w:tab/>
-        <w:t xml:space="preserve">MicroPython, “Quick reference for the ESP32 — MicroPython documentation.” Accessed: Aug.15,2026, </w:t>
-      </w:r>
-      <w:r>
-        <w:rPr>
-          <w:rFonts w:ascii="Times New Roman" w:hAnsi="Times New Roman"/>
-          <w:sz w:val="22"/>
-        </w:rPr>
-        <w:t xml:space="preserve">[Online]. Available: </w:t>
-      </w:r>
-      <w:hyperlink r:id="rId59">
-        <w:r>
-          <w:rPr>
-            <w:color w:val="0563C1"/>
-            <w:u w:val="single"/>
-            <w:sz w:val="22"/>
-            <w:rFonts w:ascii="Times New Roman" w:hAnsi="Times New Roman"/>
-          </w:rPr>
-          <w:t xml:space="preserve">https://docs.micropython.org/en/latest/esp32/quickref.html</w:t>
-        </w:r>
-      </w:hyperlink>
-      <w:r>
-        <w:rPr>
-          <w:rFonts w:ascii="Times New Roman" w:hAnsi="Times New Roman"/>
-          <w:sz w:val="22"/>
-        </w:rPr>
-        <w:t>.</w:t>
+        <w:t>MicroPython, “Quick reference for the ESP32 — MicroPython documentation.” Accessed: Aug.15,2026. [Online]. Available: https://docs.micropython.org/en/latest/esp32/quickref.html</w:t>
       </w:r>
     </w:p>
     <w:p>
@@ -9914,38 +9046,11 @@
         <w:ind w:left="720" w:hanging="720"/>
       </w:pPr>
       <w:r>
-        <w:rPr>
-          <w:rFonts w:ascii="Times New Roman" w:hAnsi="Times New Roman"/>
-          <w:sz w:val="22"/>
-        </w:rPr>
         <w:t>[36]</w:t>
+      </w:r>
+      <w:r>
         <w:tab/>
-        <w:t xml:space="preserve">A. H. Alaoui, A. Meddaoui, and M. Hain, “AI-driven predictive maintenance for Industry 4.0: A systematic review of models, methods, and challenges,” The International Journal of Advanced Manufacturing Technology, vol. 143, pp. 4861–4876, 2026, </w:t>
-      </w:r>
-      <w:r>
-        <w:rPr>
-          <w:rFonts w:ascii="Times New Roman" w:hAnsi="Times New Roman"/>
-          <w:sz w:val="22"/>
-        </w:rPr>
-        <w:t xml:space="preserve">doi: </w:t>
-      </w:r>
-      <w:hyperlink r:id="rId60">
-        <w:r>
-          <w:rPr>
-            <w:color w:val="0563C1"/>
-            <w:u w:val="single"/>
-            <w:sz w:val="22"/>
-            <w:rFonts w:ascii="Times New Roman" w:hAnsi="Times New Roman"/>
-          </w:rPr>
-          <w:t xml:space="preserve">10.1007/s00170-026-17531-w</w:t>
-        </w:r>
-      </w:hyperlink>
-      <w:r>
-        <w:rPr>
-          <w:rFonts w:ascii="Times New Roman" w:hAnsi="Times New Roman"/>
-          <w:sz w:val="22"/>
-        </w:rPr>
-        <w:t>.</w:t>
+        <w:t>A. H. Alaoui, A. Meddaoui, and M. Hain, “AI-driven predictive maintenance for Industry 4.0: A systematic review of models, methods, and challenges,” The International Journal of Advanced Manufacturing Technology, vol. 143, pp. 4861–4876, 2026. [Online]. Available: https://doi.org/10.1007/s00170-026-17531-w</w:t>
       </w:r>
     </w:p>
     <w:p>
@@ -9953,38 +9058,11 @@
         <w:ind w:left="720" w:hanging="720"/>
       </w:pPr>
       <w:r>
-        <w:rPr>
-          <w:rFonts w:ascii="Times New Roman" w:hAnsi="Times New Roman"/>
-          <w:sz w:val="22"/>
-        </w:rPr>
         <w:t>[37]</w:t>
+      </w:r>
+      <w:r>
         <w:tab/>
-        <w:t xml:space="preserve">N. Ringler, D. Knittel, J.-C. Ponsart, M. Nouari, A. Yakob, and D. Romani, “Machine learning based real time predictive maintenance at the edge for manufacturing systems: A practical example,” in Proc. IEEE IAS Global Conf. Emerging Technologies (GlobConET), London, U.K., May 2023, </w:t>
-      </w:r>
-      <w:r>
-        <w:rPr>
-          <w:rFonts w:ascii="Times New Roman" w:hAnsi="Times New Roman"/>
-          <w:sz w:val="22"/>
-        </w:rPr>
-        <w:t xml:space="preserve">doi: </w:t>
-      </w:r>
-      <w:hyperlink r:id="rId61">
-        <w:r>
-          <w:rPr>
-            <w:color w:val="0563C1"/>
-            <w:u w:val="single"/>
-            <w:sz w:val="22"/>
-            <w:rFonts w:ascii="Times New Roman" w:hAnsi="Times New Roman"/>
-          </w:rPr>
-          <w:t xml:space="preserve">10.1109/GlobConET56651.2023.10150033</w:t>
-        </w:r>
-      </w:hyperlink>
-      <w:r>
-        <w:rPr>
-          <w:rFonts w:ascii="Times New Roman" w:hAnsi="Times New Roman"/>
-          <w:sz w:val="22"/>
-        </w:rPr>
-        <w:t>.</w:t>
+        <w:t>N. Ringler, D. Knittel, J.-C. Ponsart, M. Nouari, A. Yakob, and D. Romani, “Machine learning based real time predictive maintenance at the edge for manufacturing systems: A practical example,” in Proc. IEEE IAS Global Conf. Emerging Technologies (GlobConET), London, U.K., May 2023, doi: 10.1109/GlobConET56651.2023.10150033.https://ieeexplore.ieee.org/</w:t>
       </w:r>
     </w:p>
     <w:p>
@@ -9992,38 +9070,12 @@
         <w:ind w:left="720" w:hanging="720"/>
       </w:pPr>
       <w:r>
-        <w:rPr>
-          <w:rFonts w:ascii="Times New Roman" w:hAnsi="Times New Roman"/>
-          <w:sz w:val="22"/>
-        </w:rPr>
+        <w:lastRenderedPageBreak/>
         <w:t>[38]</w:t>
+      </w:r>
+      <w:r>
         <w:tab/>
-        <w:t xml:space="preserve">A. Fernández-Miguel, S. Ortíz-Marcos, M. Jiménez-Calzado, A. P. Fernández del Hoyo, F. E. García-Muiña, and D. Settembre-Blundo, “Agentic AI in smart manufacturing: Enabling human-centric predictive maintenance ecosystems,” Applied Sciences, vol. 15, no. 21, art. no. 11414, Oct. 2025, </w:t>
-      </w:r>
-      <w:r>
-        <w:rPr>
-          <w:rFonts w:ascii="Times New Roman" w:hAnsi="Times New Roman"/>
-          <w:sz w:val="22"/>
-        </w:rPr>
-        <w:t xml:space="preserve">doi: </w:t>
-      </w:r>
-      <w:hyperlink r:id="rId62">
-        <w:r>
-          <w:rPr>
-            <w:color w:val="0563C1"/>
-            <w:u w:val="single"/>
-            <w:sz w:val="22"/>
-            <w:rFonts w:ascii="Times New Roman" w:hAnsi="Times New Roman"/>
-          </w:rPr>
-          <w:t xml:space="preserve">10.3390/app152111414</w:t>
-        </w:r>
-      </w:hyperlink>
-      <w:r>
-        <w:rPr>
-          <w:rFonts w:ascii="Times New Roman" w:hAnsi="Times New Roman"/>
-          <w:sz w:val="22"/>
-        </w:rPr>
-        <w:t>.</w:t>
+        <w:t>A. Fernández-Miguel, S. Ortíz-Marcos, M. Jiménez-Calzado, A. P. Fernández del Hoyo, F. E. García-Muiña, and D. Settembre-Blundo, “Agentic AI in smart manufacturing: Enabling human-centric predictive maintenance ecosystems,” Applied Sciences, vol. 15, no. 21, art. no. 11414, Oct. 2025, doi: 10.3390/app152111414.</w:t>
       </w:r>
     </w:p>
     <w:p>
@@ -10031,74 +9083,20 @@
         <w:ind w:left="720" w:hanging="720"/>
       </w:pPr>
       <w:r>
-        <w:rPr>
-          <w:rFonts w:ascii="Times New Roman" w:hAnsi="Times New Roman"/>
-          <w:sz w:val="22"/>
-        </w:rPr>
         <w:t>[39]</w:t>
+      </w:r>
+      <w:r>
         <w:tab/>
-        <w:t xml:space="preserve">S. Gawde, S. Patil, S. Kumar, P. Kamat, K. Kotecha, and S. Alfarhood, “Explainable predictive maintenance of rotating machines using LIME, SHAP, PDP, ICE,” IEEE Access, vol. 12, pp. 29345–29361, 2024, </w:t>
-      </w:r>
-      <w:r>
-        <w:rPr>
-          <w:rFonts w:ascii="Times New Roman" w:hAnsi="Times New Roman"/>
-          <w:sz w:val="22"/>
-        </w:rPr>
-        <w:t xml:space="preserve">doi: </w:t>
-      </w:r>
-      <w:hyperlink r:id="rId63">
-        <w:r>
-          <w:rPr>
-            <w:color w:val="0563C1"/>
-            <w:u w:val="single"/>
-            <w:sz w:val="22"/>
-            <w:rFonts w:ascii="Times New Roman" w:hAnsi="Times New Roman"/>
-          </w:rPr>
-          <w:t xml:space="preserve">10.1109/ACCESS.2024.3367110</w:t>
-        </w:r>
-      </w:hyperlink>
-      <w:r>
-        <w:rPr>
-          <w:rFonts w:ascii="Times New Roman" w:hAnsi="Times New Roman"/>
-          <w:sz w:val="22"/>
-        </w:rPr>
-        <w:t>.</w:t>
+        <w:t>S. Gawde, S. Patil, S. Kumar, P. Kamat, K. Kotecha, and S. Alfarhood, “Explainable predictive maintenance of rotating machines using LIME, SHAP, PDP, ICE,” IEEE Access, vol. 12, pp. 29345–29361, 2024. [Online]. Available: https://doi.org/10.1109/ACCESS.2024.3367110</w:t>
       </w:r>
     </w:p>
     <w:p>
       <w:r>
-        <w:rPr>
-          <w:rFonts w:ascii="Times New Roman" w:hAnsi="Times New Roman"/>
-          <w:sz w:val="22"/>
-        </w:rPr>
         <w:t>[40]</w:t>
+      </w:r>
+      <w:r>
         <w:tab/>
-        <w:t xml:space="preserve">S. Gupta and S. N. Shivhare, “Embedded TinyML for predictive maintenance: Vibration analysis on ESP32 with real-time fault detection in industrial equipment,” International Journal on Computational Modelling Applications, vol. 2, no. 2, pp. 1–17, 2025, </w:t>
-      </w:r>
-      <w:r>
-        <w:rPr>
-          <w:rFonts w:ascii="Times New Roman" w:hAnsi="Times New Roman"/>
-          <w:sz w:val="22"/>
-        </w:rPr>
-        <w:t xml:space="preserve">doi: </w:t>
-      </w:r>
-      <w:hyperlink r:id="rId64">
-        <w:r>
-          <w:rPr>
-            <w:color w:val="0563C1"/>
-            <w:u w:val="single"/>
-            <w:sz w:val="22"/>
-            <w:rFonts w:ascii="Times New Roman" w:hAnsi="Times New Roman"/>
-          </w:rPr>
-          <w:t xml:space="preserve">10.63503/j.ijcma.2025.114</w:t>
-        </w:r>
-      </w:hyperlink>
-      <w:r>
-        <w:rPr>
-          <w:rFonts w:ascii="Times New Roman" w:hAnsi="Times New Roman"/>
-          <w:sz w:val="22"/>
-        </w:rPr>
-        <w:t>.</w:t>
+        <w:t>S. Gupta and S. N. Shivhare, “Embedded TinyML for predictive maintenance: Vibration analysis on ESP32 with real-time fault detection in industrial equipment,” International Journal on Computational Modelling Applications, vol. 2, no. 2, pp. 1–17, 2025, doi: 10.63503/j.ijcma.2025.114.</w:t>
       </w:r>
     </w:p>
     <w:p>

</xml_diff>